<commit_message>
fix repo, jan start, cal fixes
</commit_message>
<xml_diff>
--- a/flow/20230914_vu_template/drafts/2024-12-u/22-НД-26_ПП_Св_Отців-Анастасії-г1.docx
+++ b/flow/20230914_vu_template/drafts/2024-12-u/22-НД-26_ПП_Св_Отців-Анастасії-г1.docx
@@ -155,17 +155,21 @@
       </w:pPr>
       <w:r>
         <w:rPr>
-          <w:rFonts w:ascii="Times New Roman" w:hAnsi="Times New Roman"/>
-          <w:i/>
-          <w:color w:val="FF0000"/>
-          <w:sz w:val="24"/>
-        </w:rPr>
-        <w:t>Священник:</w:t>
-      </w:r>
-      <w:r>
-        <w:rPr>
-          <w:rFonts w:ascii="Times New Roman" w:hAnsi="Times New Roman"/>
-          <w:sz w:val="24"/>
+          <w:rFonts w:ascii="Times New Roman" w:cs="Times New Roman" w:eastAsia="Times New Roman" w:hAnsi="Times New Roman"/>
+          <w:i w:val="1"/>
+          <w:color w:val="ff0000"/>
+          <w:sz w:val="24"/>
+          <w:szCs w:val="24"/>
+          <w:rtl w:val="0"/>
+        </w:rPr>
+        <w:t xml:space="preserve">Священник:</w:t>
+      </w:r>
+      <w:r>
+        <w:rPr>
+          <w:rFonts w:ascii="Times New Roman" w:cs="Times New Roman" w:eastAsia="Times New Roman" w:hAnsi="Times New Roman"/>
+          <w:sz w:val="24"/>
+          <w:szCs w:val="24"/>
+          <w:rtl w:val="0"/>
         </w:rPr>
         <w:t xml:space="preserve"> Благословенний Бог наш завжди, нині і повсякчас, і на віки віків.</w:t>
       </w:r>
@@ -405,17 +409,21 @@
       </w:pPr>
       <w:r>
         <w:rPr>
-          <w:rFonts w:ascii="Times New Roman" w:hAnsi="Times New Roman"/>
-          <w:i/>
-          <w:color w:val="FF0000"/>
-          <w:sz w:val="24"/>
-        </w:rPr>
-        <w:t>Священник:</w:t>
-      </w:r>
-      <w:r>
-        <w:rPr>
-          <w:rFonts w:ascii="Times New Roman" w:hAnsi="Times New Roman"/>
-          <w:sz w:val="24"/>
+          <w:rFonts w:ascii="Times New Roman" w:cs="Times New Roman" w:eastAsia="Times New Roman" w:hAnsi="Times New Roman"/>
+          <w:i w:val="1"/>
+          <w:color w:val="ff0000"/>
+          <w:sz w:val="24"/>
+          <w:szCs w:val="24"/>
+          <w:rtl w:val="0"/>
+        </w:rPr>
+        <w:t xml:space="preserve">Священник:</w:t>
+      </w:r>
+      <w:r>
+        <w:rPr>
+          <w:rFonts w:ascii="Times New Roman" w:cs="Times New Roman" w:eastAsia="Times New Roman" w:hAnsi="Times New Roman"/>
+          <w:sz w:val="24"/>
+          <w:szCs w:val="24"/>
+          <w:rtl w:val="0"/>
         </w:rPr>
         <w:t xml:space="preserve"> Бо Твоє є царство, і сила, і слава, Отця, і Сина, і Святого Духа, нині, і повсякчас, і на віки віків.</w:t>
       </w:r>
@@ -2661,17 +2669,21 @@
       </w:pPr>
       <w:r>
         <w:rPr>
-          <w:rFonts w:ascii="Times New Roman" w:hAnsi="Times New Roman"/>
-          <w:i/>
-          <w:color w:val="FF0000"/>
-          <w:sz w:val="24"/>
-        </w:rPr>
-        <w:t>Священник:</w:t>
-      </w:r>
-      <w:r>
-        <w:rPr>
-          <w:rFonts w:ascii="Times New Roman" w:hAnsi="Times New Roman"/>
-          <w:sz w:val="24"/>
+          <w:rFonts w:ascii="Times New Roman" w:cs="Times New Roman" w:eastAsia="Times New Roman" w:hAnsi="Times New Roman"/>
+          <w:i w:val="1"/>
+          <w:color w:val="ff0000"/>
+          <w:sz w:val="24"/>
+          <w:szCs w:val="24"/>
+          <w:rtl w:val="0"/>
+        </w:rPr>
+        <w:t xml:space="preserve">Священник:</w:t>
+      </w:r>
+      <w:r>
+        <w:rPr>
+          <w:rFonts w:ascii="Times New Roman" w:cs="Times New Roman" w:eastAsia="Times New Roman" w:hAnsi="Times New Roman"/>
+          <w:sz w:val="24"/>
+          <w:szCs w:val="24"/>
+          <w:rtl w:val="0"/>
         </w:rPr>
         <w:t xml:space="preserve"> Бо Тобі належить усяка слава, честь і поклоніння, Отцю, і Сину, і Святому Духові, нині, і повсякчас, і на віки віків.</w:t>
       </w:r>
@@ -3326,17 +3338,21 @@
       </w:pPr>
       <w:r>
         <w:rPr>
-          <w:rFonts w:ascii="Times New Roman" w:hAnsi="Times New Roman"/>
-          <w:i/>
-          <w:color w:val="FF0000"/>
-          <w:sz w:val="24"/>
-        </w:rPr>
-        <w:t>Священник:</w:t>
-      </w:r>
-      <w:r>
-        <w:rPr>
-          <w:rFonts w:ascii="Times New Roman" w:hAnsi="Times New Roman"/>
-          <w:sz w:val="24"/>
+          <w:rFonts w:ascii="Times New Roman" w:cs="Times New Roman" w:eastAsia="Times New Roman" w:hAnsi="Times New Roman"/>
+          <w:i w:val="1"/>
+          <w:color w:val="ff0000"/>
+          <w:sz w:val="24"/>
+          <w:szCs w:val="24"/>
+          <w:rtl w:val="0"/>
+        </w:rPr>
+        <w:t xml:space="preserve">Священник:</w:t>
+      </w:r>
+      <w:r>
+        <w:rPr>
+          <w:rFonts w:ascii="Times New Roman" w:cs="Times New Roman" w:eastAsia="Times New Roman" w:hAnsi="Times New Roman"/>
+          <w:sz w:val="24"/>
+          <w:szCs w:val="24"/>
+          <w:rtl w:val="0"/>
         </w:rPr>
         <w:t xml:space="preserve"> Бо Твоя є влада і Твоє є царство, і сила, і слава, Отця, і Сина, і Святого Духа, нині, і повсякчас, і на віки віків.</w:t>
       </w:r>
@@ -4264,21 +4280,28 @@
       <w:r>
         <w:rPr>
           <w:rFonts w:ascii="Times New Roman" w:cs="Times New Roman" w:eastAsia="Times New Roman" w:hAnsi="Times New Roman"/>
-          <w:sz w:val="24"/>
-          <w:szCs w:val="24"/>
-          <w:rtl w:val="0"/>
-        </w:rPr>
-        <w:t xml:space="preserve">Оспі́вуймо Того́, хто за нас доброві́льно розп’я́вся,* ви́терпів стра́сті і був похо́ваний* та й воскре́с із ме́ртвих,* промовля́ючи до Ньо́го:* Хри́сте, укріпи́ правосла́в’ям Це́ркву Твою́* і втихоми́р на́ше життя́,* бо ти ласка́вий і людинолю́бний.</w:t>
-      </w:r>
-    </w:p>
-    <w:p>
-      <w:pPr>
-        <w:spacing w:after="120" w:line="240" w:lineRule="auto"/>
-        <w:rPr>
-          <w:rFonts w:ascii="Times New Roman" w:cs="Times New Roman" w:eastAsia="Times New Roman" w:hAnsi="Times New Roman"/>
-          <w:sz w:val="24"/>
-          <w:szCs w:val="24"/>
-        </w:rPr>
+          <w:i w:val="1"/>
+          <w:color w:val="ff0000"/>
+          <w:sz w:val="24"/>
+          <w:szCs w:val="24"/>
+          <w:rtl w:val="0"/>
+        </w:rPr>
+        <w:t xml:space="preserve">(г. 1, подібний: Преславні мученики):</w:t>
+      </w:r>
+      <w:r>
+        <w:rPr>
+          <w:rFonts w:ascii="Times New Roman" w:cs="Times New Roman" w:eastAsia="Times New Roman" w:hAnsi="Times New Roman"/>
+          <w:sz w:val="24"/>
+          <w:szCs w:val="24"/>
+          <w:rtl w:val="0"/>
+        </w:rPr>
+        <w:t xml:space="preserve"> «Земля уся,* зішестя Боже бачить і радіє,* волхви дари мені приносять,* небо зорею віщає,* ангели славлять,* пастирі у полі дивом повняться,* ясла немов престол вогневидний приймають мене,* – Радуйся, Мати, видінням оцим!»</w:t>
+      </w:r>
+    </w:p>
+    <w:p>
+      <w:pPr>
+        <w:spacing w:after="120" w:lineRule="auto"/>
+        <w:rPr/>
       </w:pPr>
       <w:r>
         <w:rPr>
@@ -4334,17 +4357,13 @@
           <w:szCs w:val="24"/>
           <w:rtl w:val="0"/>
         </w:rPr>
-        <w:t xml:space="preserve">Ста́вши пе́ред Твої́м гро́бом, що життя́ прийня́в,* ми, недосто́йні, возсила́ємо сла́ву Твоє́му несказа́нному милосе́рдю, Хри́сте, Бо́же наш,* Ти бо, безгрі́шний,* прийня́в стра́сті і смерть, щоб, як Людинолю́бний,* да́ти сві́тові воскресі́ння.</w:t>
-      </w:r>
-    </w:p>
-    <w:p>
-      <w:pPr>
-        <w:spacing w:after="120" w:line="240" w:lineRule="auto"/>
-        <w:rPr>
-          <w:rFonts w:ascii="Times New Roman" w:cs="Times New Roman" w:eastAsia="Times New Roman" w:hAnsi="Times New Roman"/>
-          <w:sz w:val="24"/>
-          <w:szCs w:val="24"/>
-        </w:rPr>
+        <w:t xml:space="preserve">«Світло на просвіту народів,* прийшов єси огорнутий в подобу мого виду,* Сину мій безначальний,* Отця пребезначального несказанне Рождення,* збагатити бо грядеш зубожілу людськість* убогістю, що Тебе огортає,* – оспівую, Господи, Твоє милосердя».</w:t>
+      </w:r>
+    </w:p>
+    <w:p>
+      <w:pPr>
+        <w:spacing w:after="120" w:lineRule="auto"/>
+        <w:rPr/>
       </w:pPr>
       <w:r>
         <w:rPr>
@@ -4396,13 +4415,66 @@
       <w:r>
         <w:rPr>
           <w:rFonts w:ascii="Times New Roman" w:cs="Times New Roman" w:eastAsia="Times New Roman" w:hAnsi="Times New Roman"/>
-          <w:i w:val="1"/>
-          <w:color w:val="ff0000"/>
-          <w:sz w:val="24"/>
-          <w:szCs w:val="24"/>
-          <w:rtl w:val="0"/>
-        </w:rPr>
-        <w:t>(г. 6, подібний: Поклавши всю надію):</w:t>
+          <w:sz w:val="24"/>
+          <w:szCs w:val="24"/>
+          <w:rtl w:val="0"/>
+        </w:rPr>
+        <w:t xml:space="preserve">«Младенцем бачачи мене, Мати,* у своїх обіймах – возвеселися,* бо прийшов я від Адама відняти весь біль,* якого зазнав він,* споживши плід древа,* поради злобної послухавши зміїної,* і став чужим для райських насолод* і підпав тлінню». </w:t>
+      </w:r>
+    </w:p>
+    <w:p>
+      <w:pPr>
+        <w:spacing w:after="120" w:line="240" w:lineRule="auto"/>
+        <w:jc w:val="both"/>
+        <w:rPr>
+          <w:rFonts w:ascii="Times New Roman" w:cs="Times New Roman" w:eastAsia="Times New Roman" w:hAnsi="Times New Roman"/>
+          <w:sz w:val="24"/>
+          <w:szCs w:val="24"/>
+          <w:u w:val="single"/>
+        </w:rPr>
+      </w:pPr>
+      <w:r>
+        <w:rPr>
+          <w:rFonts w:ascii="Times New Roman" w:cs="Times New Roman" w:eastAsia="Times New Roman" w:hAnsi="Times New Roman"/>
+          <w:i w:val="1"/>
+          <w:color w:val="ff0000"/>
+          <w:sz w:val="24"/>
+          <w:szCs w:val="24"/>
+          <w:rtl w:val="0"/>
+        </w:rPr>
+        <w:t xml:space="preserve">Стих: </w:t>
+      </w:r>
+      <w:r>
+        <w:rPr>
+          <w:rFonts w:ascii="Times New Roman" w:cs="Times New Roman" w:eastAsia="Times New Roman" w:hAnsi="Times New Roman"/>
+          <w:sz w:val="24"/>
+          <w:szCs w:val="24"/>
+          <w:u w:val="single"/>
+          <w:rtl w:val="0"/>
+        </w:rPr>
+        <w:t xml:space="preserve">Бо в Господа милість і відкуплення велике в нього;* він визволить Ізраїля від усього беззаконня його.</w:t>
+      </w:r>
+    </w:p>
+    <w:p>
+      <w:pPr>
+        <w:spacing w:after="120" w:line="240" w:lineRule="auto"/>
+        <w:jc w:val="both"/>
+        <w:rPr>
+          <w:rFonts w:ascii="Times New Roman" w:cs="Times New Roman" w:eastAsia="Times New Roman" w:hAnsi="Times New Roman"/>
+          <w:sz w:val="24"/>
+          <w:szCs w:val="24"/>
+        </w:rPr>
+      </w:pPr>
+      <w:r>
+        <w:rPr>
+          <w:rFonts w:ascii="Times New Roman" w:cs="Times New Roman" w:eastAsia="Times New Roman" w:hAnsi="Times New Roman"/>
+          <w:i w:val="1"/>
+          <w:color w:val="ff0000"/>
+          <w:sz w:val="24"/>
+          <w:szCs w:val="24"/>
+          <w:rtl w:val="0"/>
+        </w:rPr>
+        <w:t xml:space="preserve">(г. 6, подібний: Поклавши всю надію):</w:t>
       </w:r>
       <w:r>
         <w:rPr>
@@ -4416,718 +4488,185 @@
     </w:p>
     <w:p>
       <w:pPr>
-        <w:spacing w:after="120"/>
-        <w:jc w:val="both"/>
-      </w:pPr>
-      <w:r>
-        <w:rPr>
-          <w:rFonts w:ascii="Times New Roman" w:hAnsi="Times New Roman"/>
-          <w:i/>
-          <w:color w:val="FF0000"/>
-          <w:sz w:val="24"/>
-        </w:rPr>
-        <w:t>Стих:</w:t>
-      </w:r>
-      <w:r>
-        <w:rPr>
-          <w:rFonts w:ascii="Times New Roman" w:hAnsi="Times New Roman"/>
-          <w:i/>
-          <w:sz w:val="24"/>
+        <w:spacing w:after="120" w:line="240" w:lineRule="auto"/>
+        <w:jc w:val="center"/>
+        <w:rPr>
+          <w:rFonts w:ascii="Times New Roman" w:cs="Times New Roman" w:eastAsia="Times New Roman" w:hAnsi="Times New Roman"/>
+          <w:b w:val="1"/>
+          <w:i w:val="1"/>
+          <w:color w:val="ff0000"/>
+          <w:sz w:val="24"/>
+          <w:szCs w:val="24"/>
+        </w:rPr>
+      </w:pPr>
+      <w:r>
+        <w:rPr>
+          <w:rFonts w:ascii="Times New Roman" w:cs="Times New Roman" w:eastAsia="Times New Roman" w:hAnsi="Times New Roman"/>
+          <w:b w:val="1"/>
+          <w:i w:val="1"/>
+          <w:color w:val="ff0000"/>
+          <w:sz w:val="24"/>
+          <w:szCs w:val="24"/>
+          <w:rtl w:val="0"/>
+        </w:rPr>
+        <w:t xml:space="preserve">Псалом 116</w:t>
+      </w:r>
+    </w:p>
+    <w:p>
+      <w:pPr>
+        <w:spacing w:after="120" w:line="240" w:lineRule="auto"/>
+        <w:jc w:val="both"/>
+        <w:rPr>
+          <w:rFonts w:ascii="Times New Roman" w:cs="Times New Roman" w:eastAsia="Times New Roman" w:hAnsi="Times New Roman"/>
+          <w:sz w:val="24"/>
+          <w:szCs w:val="24"/>
+          <w:u w:val="single"/>
+        </w:rPr>
+      </w:pPr>
+      <w:r>
+        <w:rPr>
+          <w:rFonts w:ascii="Times New Roman" w:cs="Times New Roman" w:eastAsia="Times New Roman" w:hAnsi="Times New Roman"/>
+          <w:i w:val="1"/>
+          <w:color w:val="ff0000"/>
+          <w:sz w:val="24"/>
+          <w:szCs w:val="24"/>
+          <w:rtl w:val="0"/>
+        </w:rPr>
+        <w:t xml:space="preserve">Стих:</w:t>
+      </w:r>
+      <w:r>
+        <w:rPr>
+          <w:rFonts w:ascii="Times New Roman" w:cs="Times New Roman" w:eastAsia="Times New Roman" w:hAnsi="Times New Roman"/>
+          <w:i w:val="1"/>
+          <w:sz w:val="24"/>
+          <w:szCs w:val="24"/>
+          <w:rtl w:val="0"/>
         </w:rPr>
         <w:t xml:space="preserve"> </w:t>
       </w:r>
       <w:r>
         <w:rPr>
-          <w:rFonts w:ascii="Times New Roman" w:hAnsi="Times New Roman"/>
-          <w:sz w:val="24"/>
+          <w:rFonts w:ascii="Times New Roman" w:cs="Times New Roman" w:eastAsia="Times New Roman" w:hAnsi="Times New Roman"/>
+          <w:sz w:val="24"/>
+          <w:szCs w:val="24"/>
           <w:u w:val="single"/>
-        </w:rPr>
-        <w:t>Бо</w:t>
-      </w:r>
-      <w:r>
-        <w:rPr>
-          <w:rFonts w:ascii="Times New Roman" w:hAnsi="Times New Roman"/>
-          <w:sz w:val="24"/>
+          <w:rtl w:val="0"/>
+        </w:rPr>
+        <w:t xml:space="preserve">Хваліте Господа всі народи!* Прославляйте його всі люди!</w:t>
+      </w:r>
+    </w:p>
+    <w:p>
+      <w:pPr>
+        <w:spacing w:after="120" w:line="240" w:lineRule="auto"/>
+        <w:jc w:val="both"/>
+        <w:rPr>
+          <w:rFonts w:ascii="Times New Roman" w:cs="Times New Roman" w:eastAsia="Times New Roman" w:hAnsi="Times New Roman"/>
+          <w:sz w:val="24"/>
+          <w:szCs w:val="24"/>
+        </w:rPr>
+      </w:pPr>
+      <w:r>
+        <w:rPr>
+          <w:rFonts w:ascii="Times New Roman" w:cs="Times New Roman" w:eastAsia="Times New Roman" w:hAnsi="Times New Roman"/>
+          <w:sz w:val="24"/>
+          <w:szCs w:val="24"/>
+          <w:rtl w:val="0"/>
+        </w:rPr>
+        <w:t xml:space="preserve">Бог Слово, якому служать херувими,* з'єднався особою своєю з тілом* і поселився в непорочному лоні:* став людиною і йде на землю,* щоб народитися з покоління Юди.* Святий вертепе, приготуйся Цареві всіх,* як величава палата,* а ви, ясла, як престол вогненний, де Діва Марія покладе Дитятко,* на оновлення всього створіння.</w:t>
+      </w:r>
+    </w:p>
+    <w:p>
+      <w:pPr>
+        <w:spacing w:after="120" w:line="240" w:lineRule="auto"/>
+        <w:jc w:val="both"/>
+        <w:rPr>
+          <w:rFonts w:ascii="Times New Roman" w:cs="Times New Roman" w:eastAsia="Times New Roman" w:hAnsi="Times New Roman"/>
+          <w:sz w:val="24"/>
+          <w:szCs w:val="24"/>
           <w:u w:val="single"/>
         </w:rPr>
+      </w:pPr>
+      <w:r>
+        <w:rPr>
+          <w:rFonts w:ascii="Times New Roman" w:cs="Times New Roman" w:eastAsia="Times New Roman" w:hAnsi="Times New Roman"/>
+          <w:i w:val="1"/>
+          <w:color w:val="ff0000"/>
+          <w:sz w:val="24"/>
+          <w:szCs w:val="24"/>
+          <w:rtl w:val="0"/>
+        </w:rPr>
+        <w:t xml:space="preserve">Стих: </w:t>
+      </w:r>
+      <w:r>
+        <w:rPr>
+          <w:rFonts w:ascii="Times New Roman" w:cs="Times New Roman" w:eastAsia="Times New Roman" w:hAnsi="Times New Roman"/>
+          <w:sz w:val="24"/>
+          <w:szCs w:val="24"/>
+          <w:u w:val="single"/>
+          <w:rtl w:val="0"/>
+        </w:rPr>
+        <w:t xml:space="preserve">Велике бо до нас його милосердя, і вірність Господа повіки.</w:t>
+      </w:r>
+    </w:p>
+    <w:p>
+      <w:pPr>
+        <w:spacing w:after="120" w:line="240" w:lineRule="auto"/>
+        <w:jc w:val="both"/>
+        <w:rPr>
+          <w:rFonts w:ascii="Times New Roman" w:cs="Times New Roman" w:eastAsia="Times New Roman" w:hAnsi="Times New Roman"/>
+          <w:sz w:val="24"/>
+          <w:szCs w:val="24"/>
+        </w:rPr>
+      </w:pPr>
+      <w:r>
+        <w:rPr>
+          <w:rFonts w:ascii="Times New Roman" w:cs="Times New Roman" w:eastAsia="Times New Roman" w:hAnsi="Times New Roman"/>
+          <w:sz w:val="24"/>
+          <w:szCs w:val="24"/>
+          <w:rtl w:val="0"/>
+        </w:rPr>
+        <w:t xml:space="preserve">У безсловесних яслах Діва складає тебе,* безначальне Слово Боже, що незбагненно зачалося;* бо ти, єдиний Чоловіколюбче, приходиш,* щоб звільнити нас від нерозуму,* в який попали ми з заздрости змія.* Ти уповився пелюшками, щоб розірвати лахміття* і мотуззя гріхів наших.* Тому славимо тебе, Милосердний, і радісно оспівуємо та поклоняємось* тілесному твоєму приходові, що став нам визволенням.</w:t>
+      </w:r>
+    </w:p>
+    <w:p>
+      <w:pPr>
+        <w:spacing w:after="120" w:line="240" w:lineRule="auto"/>
+        <w:jc w:val="both"/>
+        <w:rPr>
+          <w:rFonts w:ascii="Times New Roman" w:cs="Times New Roman" w:eastAsia="Times New Roman" w:hAnsi="Times New Roman"/>
+          <w:sz w:val="24"/>
+          <w:szCs w:val="24"/>
+        </w:rPr>
+      </w:pPr>
+      <w:r>
+        <w:rPr>
+          <w:rFonts w:ascii="Times New Roman" w:cs="Times New Roman" w:eastAsia="Times New Roman" w:hAnsi="Times New Roman"/>
+          <w:b w:val="1"/>
+          <w:sz w:val="24"/>
+          <w:szCs w:val="24"/>
+          <w:rtl w:val="0"/>
+        </w:rPr>
+        <w:t xml:space="preserve">Слава</w:t>
+      </w:r>
+      <w:r>
+        <w:rPr>
+          <w:rFonts w:ascii="Times New Roman" w:cs="Times New Roman" w:eastAsia="Times New Roman" w:hAnsi="Times New Roman"/>
+          <w:sz w:val="24"/>
+          <w:szCs w:val="24"/>
+          <w:rtl w:val="0"/>
+        </w:rPr>
         <w:t xml:space="preserve"> </w:t>
       </w:r>
       <w:r>
         <w:rPr>
-          <w:rFonts w:ascii="Times New Roman" w:hAnsi="Times New Roman"/>
-          <w:sz w:val="24"/>
-          <w:u w:val="single"/>
-        </w:rPr>
-        <w:t>в</w:t>
-      </w:r>
-      <w:r>
-        <w:rPr>
-          <w:rFonts w:ascii="Times New Roman" w:hAnsi="Times New Roman"/>
-          <w:sz w:val="24"/>
-          <w:u w:val="single"/>
-        </w:rPr>
-        <w:t xml:space="preserve"> </w:t>
-      </w:r>
-      <w:r>
-        <w:rPr>
-          <w:rFonts w:ascii="Times New Roman" w:hAnsi="Times New Roman"/>
-          <w:sz w:val="24"/>
-          <w:u w:val="single"/>
-        </w:rPr>
-        <w:t>Го́спода</w:t>
-      </w:r>
-      <w:r>
-        <w:rPr>
-          <w:rFonts w:ascii="Times New Roman" w:hAnsi="Times New Roman"/>
-          <w:sz w:val="24"/>
-          <w:u w:val="single"/>
-        </w:rPr>
-        <w:t xml:space="preserve"> </w:t>
-      </w:r>
-      <w:r>
-        <w:rPr>
-          <w:rFonts w:ascii="Times New Roman" w:hAnsi="Times New Roman"/>
-          <w:sz w:val="24"/>
-          <w:u w:val="single"/>
-        </w:rPr>
-        <w:t>ми́лість</w:t>
-      </w:r>
-      <w:r>
-        <w:rPr>
-          <w:rFonts w:ascii="Times New Roman" w:hAnsi="Times New Roman"/>
-          <w:sz w:val="24"/>
-          <w:u w:val="single"/>
-        </w:rPr>
-        <w:t xml:space="preserve"> </w:t>
-      </w:r>
-      <w:r>
-        <w:rPr>
-          <w:rFonts w:ascii="Times New Roman" w:hAnsi="Times New Roman"/>
-          <w:sz w:val="24"/>
-          <w:u w:val="single"/>
-        </w:rPr>
-        <w:t>і</w:t>
-      </w:r>
-      <w:r>
-        <w:rPr>
-          <w:rFonts w:ascii="Times New Roman" w:hAnsi="Times New Roman"/>
-          <w:sz w:val="24"/>
-          <w:u w:val="single"/>
-        </w:rPr>
-        <w:t xml:space="preserve"> </w:t>
-      </w:r>
-      <w:r>
-        <w:rPr>
-          <w:rFonts w:ascii="Times New Roman" w:hAnsi="Times New Roman"/>
-          <w:sz w:val="24"/>
-          <w:u w:val="single"/>
-        </w:rPr>
-        <w:t>відку́плення</w:t>
-      </w:r>
-      <w:r>
-        <w:rPr>
-          <w:rFonts w:ascii="Times New Roman" w:hAnsi="Times New Roman"/>
-          <w:sz w:val="24"/>
-          <w:u w:val="single"/>
-        </w:rPr>
-        <w:t xml:space="preserve"> </w:t>
-      </w:r>
-      <w:r>
-        <w:rPr>
-          <w:rFonts w:ascii="Times New Roman" w:hAnsi="Times New Roman"/>
-          <w:sz w:val="24"/>
-          <w:u w:val="single"/>
-        </w:rPr>
-        <w:t>вели́ке</w:t>
-      </w:r>
-      <w:r>
-        <w:rPr>
-          <w:rFonts w:ascii="Times New Roman" w:hAnsi="Times New Roman"/>
-          <w:sz w:val="24"/>
-          <w:u w:val="single"/>
-        </w:rPr>
-        <w:t xml:space="preserve"> </w:t>
-      </w:r>
-      <w:r>
-        <w:rPr>
-          <w:rFonts w:ascii="Times New Roman" w:hAnsi="Times New Roman"/>
-          <w:sz w:val="24"/>
-          <w:u w:val="single"/>
-        </w:rPr>
-        <w:t>в</w:t>
-      </w:r>
-      <w:r>
-        <w:rPr>
-          <w:rFonts w:ascii="Times New Roman" w:hAnsi="Times New Roman"/>
-          <w:sz w:val="24"/>
-          <w:u w:val="single"/>
-        </w:rPr>
-        <w:t xml:space="preserve"> </w:t>
-      </w:r>
-      <w:r>
-        <w:rPr>
-          <w:rFonts w:ascii="Times New Roman" w:hAnsi="Times New Roman"/>
-          <w:sz w:val="24"/>
-          <w:u w:val="single"/>
-        </w:rPr>
-        <w:t>Ньо́го;*</w:t>
-      </w:r>
-      <w:r>
-        <w:rPr>
-          <w:rFonts w:ascii="Times New Roman" w:hAnsi="Times New Roman"/>
-          <w:sz w:val="24"/>
-          <w:u w:val="single"/>
-        </w:rPr>
-        <w:t xml:space="preserve"> </w:t>
-      </w:r>
-      <w:r>
-        <w:rPr>
-          <w:rFonts w:ascii="Times New Roman" w:hAnsi="Times New Roman"/>
-          <w:sz w:val="24"/>
-          <w:u w:val="single"/>
-        </w:rPr>
-        <w:t>Він</w:t>
-      </w:r>
-      <w:r>
-        <w:rPr>
-          <w:rFonts w:ascii="Times New Roman" w:hAnsi="Times New Roman"/>
-          <w:sz w:val="24"/>
-          <w:u w:val="single"/>
-        </w:rPr>
-        <w:t xml:space="preserve"> </w:t>
-      </w:r>
-      <w:r>
-        <w:rPr>
-          <w:rFonts w:ascii="Times New Roman" w:hAnsi="Times New Roman"/>
-          <w:sz w:val="24"/>
-          <w:u w:val="single"/>
-        </w:rPr>
-        <w:t>ви́зволить</w:t>
-      </w:r>
-      <w:r>
-        <w:rPr>
-          <w:rFonts w:ascii="Times New Roman" w:hAnsi="Times New Roman"/>
-          <w:sz w:val="24"/>
-          <w:u w:val="single"/>
-        </w:rPr>
-        <w:t xml:space="preserve"> </w:t>
-      </w:r>
-      <w:r>
-        <w:rPr>
-          <w:rFonts w:ascii="Times New Roman" w:hAnsi="Times New Roman"/>
-          <w:sz w:val="24"/>
-          <w:u w:val="single"/>
-        </w:rPr>
-        <w:t>Ізра́їля</w:t>
-      </w:r>
-      <w:r>
-        <w:rPr>
-          <w:rFonts w:ascii="Times New Roman" w:hAnsi="Times New Roman"/>
-          <w:sz w:val="24"/>
-          <w:u w:val="single"/>
-        </w:rPr>
-        <w:t xml:space="preserve"> </w:t>
-      </w:r>
-      <w:r>
-        <w:rPr>
-          <w:rFonts w:ascii="Times New Roman" w:hAnsi="Times New Roman"/>
-          <w:sz w:val="24"/>
-          <w:u w:val="single"/>
-        </w:rPr>
-        <w:t>від</w:t>
-      </w:r>
-      <w:r>
-        <w:rPr>
-          <w:rFonts w:ascii="Times New Roman" w:hAnsi="Times New Roman"/>
-          <w:sz w:val="24"/>
-          <w:u w:val="single"/>
-        </w:rPr>
-        <w:t xml:space="preserve"> </w:t>
-      </w:r>
-      <w:r>
-        <w:rPr>
-          <w:rFonts w:ascii="Times New Roman" w:hAnsi="Times New Roman"/>
-          <w:sz w:val="24"/>
-          <w:u w:val="single"/>
-        </w:rPr>
-        <w:t>усьо́го</w:t>
-      </w:r>
-      <w:r>
-        <w:rPr>
-          <w:rFonts w:ascii="Times New Roman" w:hAnsi="Times New Roman"/>
-          <w:sz w:val="24"/>
-          <w:u w:val="single"/>
-        </w:rPr>
-        <w:t xml:space="preserve"> </w:t>
-      </w:r>
-      <w:r>
-        <w:rPr>
-          <w:rFonts w:ascii="Times New Roman" w:hAnsi="Times New Roman"/>
-          <w:sz w:val="24"/>
-          <w:u w:val="single"/>
-        </w:rPr>
-        <w:t>беззако́ння</w:t>
-      </w:r>
-      <w:r>
-        <w:rPr>
-          <w:rFonts w:ascii="Times New Roman" w:hAnsi="Times New Roman"/>
-          <w:sz w:val="24"/>
-          <w:u w:val="single"/>
-        </w:rPr>
-        <w:t xml:space="preserve"> </w:t>
-      </w:r>
-      <w:r>
-        <w:rPr>
-          <w:rFonts w:ascii="Times New Roman" w:hAnsi="Times New Roman"/>
-          <w:sz w:val="24"/>
-          <w:u w:val="single"/>
-        </w:rPr>
-        <w:t>його́.</w:t>
-      </w:r>
-    </w:p>
-    <w:p>
-      <w:pPr>
-        <w:spacing w:after="120" w:line="240" w:lineRule="auto"/>
-        <w:jc w:val="both"/>
-        <w:rPr>
-          <w:rFonts w:ascii="Times New Roman" w:cs="Times New Roman" w:eastAsia="Times New Roman" w:hAnsi="Times New Roman"/>
-          <w:sz w:val="24"/>
-          <w:szCs w:val="24"/>
-        </w:rPr>
-      </w:pPr>
-      <w:r>
-        <w:rPr>
-          <w:rFonts w:ascii="Times New Roman" w:cs="Times New Roman" w:eastAsia="Times New Roman" w:hAnsi="Times New Roman"/>
-          <w:sz w:val="24"/>
-          <w:szCs w:val="24"/>
-          <w:rtl w:val="0"/>
-        </w:rPr>
-        <w:t xml:space="preserve">Сонце незахідне йде, щоб засяяти з дівичого лона* і просвітити все, що під сонцем.* Тож приготуймося нині духом і поспішімось зустріти чистими очима* і добрими ділами того,* хто своїм чудесним народженням схотів прийти до своїх.* Він народжується у Вифлеємі,* щоб нас, позбавлених райського життя,* зі свого милосердя, знову до нього ввести.</w:t>
-      </w:r>
-    </w:p>
-    <w:p>
-      <w:pPr>
-        <w:spacing w:after="120" w:line="240" w:lineRule="auto"/>
-        <w:jc w:val="center"/>
-        <w:rPr>
-          <w:rFonts w:ascii="Times New Roman" w:cs="Times New Roman" w:eastAsia="Times New Roman" w:hAnsi="Times New Roman"/>
-          <w:b w:val="1"/>
-          <w:i w:val="1"/>
-          <w:color w:val="ff0000"/>
-          <w:sz w:val="24"/>
-          <w:szCs w:val="24"/>
-        </w:rPr>
-      </w:pPr>
-      <w:r>
-        <w:rPr>
-          <w:rFonts w:ascii="Times New Roman" w:cs="Times New Roman" w:eastAsia="Times New Roman" w:hAnsi="Times New Roman"/>
-          <w:b w:val="1"/>
-          <w:i w:val="1"/>
-          <w:color w:val="ff0000"/>
-          <w:sz w:val="24"/>
-          <w:szCs w:val="24"/>
-          <w:rtl w:val="0"/>
-        </w:rPr>
-        <w:t xml:space="preserve">Псалом 116</w:t>
-      </w:r>
-    </w:p>
-    <w:p>
-      <w:pPr>
-        <w:spacing w:after="120"/>
-        <w:jc w:val="both"/>
-      </w:pPr>
-      <w:r>
-        <w:rPr>
-          <w:rFonts w:ascii="Times New Roman" w:hAnsi="Times New Roman"/>
-          <w:i/>
-          <w:color w:val="FF0000"/>
-          <w:sz w:val="24"/>
-        </w:rPr>
-        <w:t>Стих:</w:t>
-      </w:r>
-      <w:r>
-        <w:rPr>
-          <w:rFonts w:ascii="Times New Roman" w:hAnsi="Times New Roman"/>
-          <w:i/>
-          <w:sz w:val="24"/>
-        </w:rPr>
-        <w:t xml:space="preserve"> </w:t>
-      </w:r>
-      <w:r>
-        <w:rPr>
-          <w:rFonts w:ascii="Times New Roman" w:hAnsi="Times New Roman"/>
-          <w:sz w:val="24"/>
-          <w:u w:val="single"/>
-        </w:rPr>
-        <w:t>Хвалі́те</w:t>
-      </w:r>
-      <w:r>
-        <w:rPr>
-          <w:rFonts w:ascii="Times New Roman" w:hAnsi="Times New Roman"/>
-          <w:sz w:val="24"/>
-          <w:u w:val="single"/>
-        </w:rPr>
-        <w:t xml:space="preserve"> </w:t>
-      </w:r>
-      <w:r>
-        <w:rPr>
-          <w:rFonts w:ascii="Times New Roman" w:hAnsi="Times New Roman"/>
-          <w:sz w:val="24"/>
-          <w:u w:val="single"/>
-        </w:rPr>
-        <w:t>Го́спода</w:t>
-      </w:r>
-      <w:r>
-        <w:rPr>
-          <w:rFonts w:ascii="Times New Roman" w:hAnsi="Times New Roman"/>
-          <w:sz w:val="24"/>
-          <w:u w:val="single"/>
-        </w:rPr>
-        <w:t xml:space="preserve"> </w:t>
-      </w:r>
-      <w:r>
-        <w:rPr>
-          <w:rFonts w:ascii="Times New Roman" w:hAnsi="Times New Roman"/>
-          <w:sz w:val="24"/>
-          <w:u w:val="single"/>
-        </w:rPr>
-        <w:t>всі</w:t>
-      </w:r>
-      <w:r>
-        <w:rPr>
-          <w:rFonts w:ascii="Times New Roman" w:hAnsi="Times New Roman"/>
-          <w:sz w:val="24"/>
-          <w:u w:val="single"/>
-        </w:rPr>
-        <w:t xml:space="preserve"> </w:t>
-      </w:r>
-      <w:r>
-        <w:rPr>
-          <w:rFonts w:ascii="Times New Roman" w:hAnsi="Times New Roman"/>
-          <w:sz w:val="24"/>
-          <w:u w:val="single"/>
-        </w:rPr>
-        <w:t>наро́ди!*</w:t>
-      </w:r>
-      <w:r>
-        <w:rPr>
-          <w:rFonts w:ascii="Times New Roman" w:hAnsi="Times New Roman"/>
-          <w:sz w:val="24"/>
-          <w:u w:val="single"/>
-        </w:rPr>
-        <w:t xml:space="preserve"> </w:t>
-      </w:r>
-      <w:r>
-        <w:rPr>
-          <w:rFonts w:ascii="Times New Roman" w:hAnsi="Times New Roman"/>
-          <w:sz w:val="24"/>
-          <w:u w:val="single"/>
-        </w:rPr>
-        <w:t>Прославля́йте</w:t>
-      </w:r>
-      <w:r>
-        <w:rPr>
-          <w:rFonts w:ascii="Times New Roman" w:hAnsi="Times New Roman"/>
-          <w:sz w:val="24"/>
-          <w:u w:val="single"/>
-        </w:rPr>
-        <w:t xml:space="preserve"> </w:t>
-      </w:r>
-      <w:r>
-        <w:rPr>
-          <w:rFonts w:ascii="Times New Roman" w:hAnsi="Times New Roman"/>
-          <w:sz w:val="24"/>
-          <w:u w:val="single"/>
-        </w:rPr>
-        <w:t>Його́</w:t>
-      </w:r>
-      <w:r>
-        <w:rPr>
-          <w:rFonts w:ascii="Times New Roman" w:hAnsi="Times New Roman"/>
-          <w:sz w:val="24"/>
-          <w:u w:val="single"/>
-        </w:rPr>
-        <w:t xml:space="preserve"> </w:t>
-      </w:r>
-      <w:r>
-        <w:rPr>
-          <w:rFonts w:ascii="Times New Roman" w:hAnsi="Times New Roman"/>
-          <w:sz w:val="24"/>
-          <w:u w:val="single"/>
-        </w:rPr>
-        <w:t>всі</w:t>
-      </w:r>
-      <w:r>
-        <w:rPr>
-          <w:rFonts w:ascii="Times New Roman" w:hAnsi="Times New Roman"/>
-          <w:sz w:val="24"/>
-          <w:u w:val="single"/>
-        </w:rPr>
-        <w:t xml:space="preserve"> </w:t>
-      </w:r>
-      <w:r>
-        <w:rPr>
-          <w:rFonts w:ascii="Times New Roman" w:hAnsi="Times New Roman"/>
-          <w:sz w:val="24"/>
-          <w:u w:val="single"/>
-        </w:rPr>
-        <w:t>лю́ди!</w:t>
-      </w:r>
-    </w:p>
-    <w:p>
-      <w:pPr>
-        <w:spacing w:after="120" w:line="240" w:lineRule="auto"/>
-        <w:jc w:val="both"/>
-        <w:rPr>
-          <w:rFonts w:ascii="Times New Roman" w:cs="Times New Roman" w:eastAsia="Times New Roman" w:hAnsi="Times New Roman"/>
-          <w:sz w:val="24"/>
-          <w:szCs w:val="24"/>
-        </w:rPr>
-      </w:pPr>
-      <w:r>
-        <w:rPr>
-          <w:rFonts w:ascii="Times New Roman" w:cs="Times New Roman" w:eastAsia="Times New Roman" w:hAnsi="Times New Roman"/>
-          <w:sz w:val="24"/>
-          <w:szCs w:val="24"/>
-          <w:rtl w:val="0"/>
-        </w:rPr>
-        <w:t xml:space="preserve">Бог Слово, якому служать херувими,* з'єднався особою своєю з тілом* і поселився в непорочному лоні:* став людиною і йде на землю,* щоб народитися з покоління Юди.* Святий вертепе, приготуйся Цареві всіх,* як величава палата,* а ви, ясла, як престол вогненний, де Діва Марія покладе Дитятко,* на оновлення всього створіння.</w:t>
-      </w:r>
-    </w:p>
-    <w:p>
-      <w:pPr>
-        <w:spacing w:after="120"/>
-        <w:jc w:val="both"/>
-      </w:pPr>
-      <w:r>
-        <w:rPr>
-          <w:rFonts w:ascii="Times New Roman" w:hAnsi="Times New Roman"/>
-          <w:i/>
-          <w:color w:val="FF0000"/>
-          <w:sz w:val="24"/>
-        </w:rPr>
-        <w:t>Стих:</w:t>
-      </w:r>
-      <w:r>
-        <w:rPr>
-          <w:rFonts w:ascii="Times New Roman" w:hAnsi="Times New Roman"/>
-          <w:i/>
-          <w:sz w:val="24"/>
-        </w:rPr>
-        <w:t xml:space="preserve"> </w:t>
-      </w:r>
-      <w:r>
-        <w:rPr>
-          <w:rFonts w:ascii="Times New Roman" w:hAnsi="Times New Roman"/>
-          <w:sz w:val="24"/>
-          <w:u w:val="single"/>
-        </w:rPr>
-        <w:t>Вели́ке</w:t>
-      </w:r>
-      <w:r>
-        <w:rPr>
-          <w:rFonts w:ascii="Times New Roman" w:hAnsi="Times New Roman"/>
-          <w:sz w:val="24"/>
-          <w:u w:val="single"/>
-        </w:rPr>
-        <w:t xml:space="preserve"> </w:t>
-      </w:r>
-      <w:r>
-        <w:rPr>
-          <w:rFonts w:ascii="Times New Roman" w:hAnsi="Times New Roman"/>
-          <w:sz w:val="24"/>
-          <w:u w:val="single"/>
-        </w:rPr>
-        <w:t>бо</w:t>
-      </w:r>
-      <w:r>
-        <w:rPr>
-          <w:rFonts w:ascii="Times New Roman" w:hAnsi="Times New Roman"/>
-          <w:sz w:val="24"/>
-          <w:u w:val="single"/>
-        </w:rPr>
-        <w:t xml:space="preserve"> </w:t>
-      </w:r>
-      <w:r>
-        <w:rPr>
-          <w:rFonts w:ascii="Times New Roman" w:hAnsi="Times New Roman"/>
-          <w:sz w:val="24"/>
-          <w:u w:val="single"/>
-        </w:rPr>
-        <w:t>до</w:t>
-      </w:r>
-      <w:r>
-        <w:rPr>
-          <w:rFonts w:ascii="Times New Roman" w:hAnsi="Times New Roman"/>
-          <w:sz w:val="24"/>
-          <w:u w:val="single"/>
-        </w:rPr>
-        <w:t xml:space="preserve"> </w:t>
-      </w:r>
-      <w:r>
-        <w:rPr>
-          <w:rFonts w:ascii="Times New Roman" w:hAnsi="Times New Roman"/>
-          <w:sz w:val="24"/>
-          <w:u w:val="single"/>
-        </w:rPr>
-        <w:t>нас</w:t>
-      </w:r>
-      <w:r>
-        <w:rPr>
-          <w:rFonts w:ascii="Times New Roman" w:hAnsi="Times New Roman"/>
-          <w:sz w:val="24"/>
-          <w:u w:val="single"/>
-        </w:rPr>
-        <w:t xml:space="preserve"> </w:t>
-      </w:r>
-      <w:r>
-        <w:rPr>
-          <w:rFonts w:ascii="Times New Roman" w:hAnsi="Times New Roman"/>
-          <w:sz w:val="24"/>
-          <w:u w:val="single"/>
-        </w:rPr>
-        <w:t>Його́</w:t>
-      </w:r>
-      <w:r>
-        <w:rPr>
-          <w:rFonts w:ascii="Times New Roman" w:hAnsi="Times New Roman"/>
-          <w:sz w:val="24"/>
-          <w:u w:val="single"/>
-        </w:rPr>
-        <w:t xml:space="preserve"> </w:t>
-      </w:r>
-      <w:r>
-        <w:rPr>
-          <w:rFonts w:ascii="Times New Roman" w:hAnsi="Times New Roman"/>
-          <w:sz w:val="24"/>
-          <w:u w:val="single"/>
-        </w:rPr>
-        <w:t>милосе́рдя,*</w:t>
-      </w:r>
-      <w:r>
-        <w:rPr>
-          <w:rFonts w:ascii="Times New Roman" w:hAnsi="Times New Roman"/>
-          <w:sz w:val="24"/>
-          <w:u w:val="single"/>
-        </w:rPr>
-        <w:t xml:space="preserve"> </w:t>
-      </w:r>
-      <w:r>
-        <w:rPr>
-          <w:rFonts w:ascii="Times New Roman" w:hAnsi="Times New Roman"/>
-          <w:sz w:val="24"/>
-          <w:u w:val="single"/>
-        </w:rPr>
-        <w:t>і</w:t>
-      </w:r>
-      <w:r>
-        <w:rPr>
-          <w:rFonts w:ascii="Times New Roman" w:hAnsi="Times New Roman"/>
-          <w:sz w:val="24"/>
-          <w:u w:val="single"/>
-        </w:rPr>
-        <w:t xml:space="preserve"> </w:t>
-      </w:r>
-      <w:r>
-        <w:rPr>
-          <w:rFonts w:ascii="Times New Roman" w:hAnsi="Times New Roman"/>
-          <w:sz w:val="24"/>
-          <w:u w:val="single"/>
-        </w:rPr>
-        <w:t>ві́рність</w:t>
-      </w:r>
-      <w:r>
-        <w:rPr>
-          <w:rFonts w:ascii="Times New Roman" w:hAnsi="Times New Roman"/>
-          <w:sz w:val="24"/>
-          <w:u w:val="single"/>
-        </w:rPr>
-        <w:t xml:space="preserve"> </w:t>
-      </w:r>
-      <w:r>
-        <w:rPr>
-          <w:rFonts w:ascii="Times New Roman" w:hAnsi="Times New Roman"/>
-          <w:sz w:val="24"/>
-          <w:u w:val="single"/>
-        </w:rPr>
-        <w:t>Го́спода</w:t>
-      </w:r>
-      <w:r>
-        <w:rPr>
-          <w:rFonts w:ascii="Times New Roman" w:hAnsi="Times New Roman"/>
-          <w:sz w:val="24"/>
-          <w:u w:val="single"/>
-        </w:rPr>
-        <w:t xml:space="preserve"> </w:t>
-      </w:r>
-      <w:r>
-        <w:rPr>
-          <w:rFonts w:ascii="Times New Roman" w:hAnsi="Times New Roman"/>
-          <w:sz w:val="24"/>
-          <w:u w:val="single"/>
-        </w:rPr>
-        <w:t>пові́ки.</w:t>
-      </w:r>
-    </w:p>
-    <w:p>
-      <w:pPr>
-        <w:spacing w:after="120" w:line="240" w:lineRule="auto"/>
-        <w:jc w:val="both"/>
-        <w:rPr>
-          <w:rFonts w:ascii="Times New Roman" w:cs="Times New Roman" w:eastAsia="Times New Roman" w:hAnsi="Times New Roman"/>
-          <w:sz w:val="24"/>
-          <w:szCs w:val="24"/>
-        </w:rPr>
-      </w:pPr>
-      <w:r>
-        <w:rPr>
-          <w:rFonts w:ascii="Times New Roman" w:cs="Times New Roman" w:eastAsia="Times New Roman" w:hAnsi="Times New Roman"/>
-          <w:sz w:val="24"/>
-          <w:szCs w:val="24"/>
-          <w:rtl w:val="0"/>
-        </w:rPr>
-        <w:t xml:space="preserve">У безсловесних яслах Діва складає тебе,* безначальне Слово Боже, що незбагненно зачалося;* бо ти, єдиний Чоловіколюбче, приходиш,* щоб звільнити нас від нерозуму,* в який попали ми з заздрости змія.* Ти уповився пелюшками, щоб розірвати лахміття* і мотуззя гріхів наших.* Тому славимо тебе, Милосердний, і радісно оспівуємо та поклоняємось* тілесному твоєму приходові, що став нам визволенням.</w:t>
-      </w:r>
-    </w:p>
-    <w:p>
-      <w:pPr>
-        <w:spacing w:after="120" w:line="240" w:lineRule="auto"/>
-        <w:jc w:val="both"/>
-        <w:rPr>
-          <w:rFonts w:ascii="Times New Roman" w:cs="Times New Roman" w:eastAsia="Times New Roman" w:hAnsi="Times New Roman"/>
-          <w:sz w:val="24"/>
-          <w:szCs w:val="24"/>
-        </w:rPr>
-      </w:pPr>
-      <w:r>
-        <w:rPr>
-          <w:rFonts w:ascii="Times New Roman" w:cs="Times New Roman" w:eastAsia="Times New Roman" w:hAnsi="Times New Roman"/>
-          <w:b w:val="1"/>
-          <w:sz w:val="24"/>
-          <w:szCs w:val="24"/>
-          <w:rtl w:val="0"/>
-        </w:rPr>
-        <w:t xml:space="preserve">Слава</w:t>
-      </w:r>
-      <w:r>
-        <w:rPr>
-          <w:rFonts w:ascii="Times New Roman" w:cs="Times New Roman" w:eastAsia="Times New Roman" w:hAnsi="Times New Roman"/>
-          <w:sz w:val="24"/>
-          <w:szCs w:val="24"/>
-          <w:rtl w:val="0"/>
-        </w:rPr>
-        <w:t xml:space="preserve"> </w:t>
-      </w:r>
-      <w:r>
-        <w:rPr>
-          <w:rFonts w:ascii="Times New Roman" w:cs="Times New Roman" w:eastAsia="Times New Roman" w:hAnsi="Times New Roman"/>
-          <w:i w:val="1"/>
-          <w:color w:val="ff0000"/>
-          <w:sz w:val="24"/>
-          <w:szCs w:val="24"/>
-          <w:rtl w:val="0"/>
-        </w:rPr>
-        <w:t>(г. 6):</w:t>
+          <w:rFonts w:ascii="Times New Roman" w:cs="Times New Roman" w:eastAsia="Times New Roman" w:hAnsi="Times New Roman"/>
+          <w:i w:val="1"/>
+          <w:color w:val="ff0000"/>
+          <w:sz w:val="24"/>
+          <w:szCs w:val="24"/>
+          <w:rtl w:val="0"/>
+        </w:rPr>
+        <w:t xml:space="preserve">(г. 6):</w:t>
       </w:r>
       <w:r>
         <w:rPr>
@@ -5586,17 +5125,21 @@
       </w:pPr>
       <w:r>
         <w:rPr>
-          <w:rFonts w:ascii="Times New Roman" w:hAnsi="Times New Roman"/>
-          <w:i/>
-          <w:color w:val="FF0000"/>
-          <w:sz w:val="24"/>
-        </w:rPr>
-        <w:t>Священник:</w:t>
-      </w:r>
-      <w:r>
-        <w:rPr>
-          <w:rFonts w:ascii="Times New Roman" w:hAnsi="Times New Roman"/>
-          <w:sz w:val="24"/>
+          <w:rFonts w:ascii="Times New Roman" w:cs="Times New Roman" w:eastAsia="Times New Roman" w:hAnsi="Times New Roman"/>
+          <w:i w:val="1"/>
+          <w:color w:val="ff0000"/>
+          <w:sz w:val="24"/>
+          <w:szCs w:val="24"/>
+          <w:rtl w:val="0"/>
+        </w:rPr>
+        <w:t xml:space="preserve">Священник:</w:t>
+      </w:r>
+      <w:r>
+        <w:rPr>
+          <w:rFonts w:ascii="Times New Roman" w:cs="Times New Roman" w:eastAsia="Times New Roman" w:hAnsi="Times New Roman"/>
+          <w:sz w:val="24"/>
+          <w:szCs w:val="24"/>
+          <w:rtl w:val="0"/>
         </w:rPr>
         <w:t xml:space="preserve"> Мир всім.</w:t>
       </w:r>
@@ -6979,17 +6522,21 @@
       </w:pPr>
       <w:r>
         <w:rPr>
-          <w:rFonts w:ascii="Times New Roman" w:hAnsi="Times New Roman"/>
-          <w:i/>
-          <w:color w:val="FF0000"/>
-          <w:sz w:val="24"/>
-        </w:rPr>
-        <w:t>Священник:</w:t>
-      </w:r>
-      <w:r>
-        <w:rPr>
-          <w:rFonts w:ascii="Times New Roman" w:hAnsi="Times New Roman"/>
-          <w:sz w:val="24"/>
+          <w:rFonts w:ascii="Times New Roman" w:cs="Times New Roman" w:eastAsia="Times New Roman" w:hAnsi="Times New Roman"/>
+          <w:i w:val="1"/>
+          <w:color w:val="ff0000"/>
+          <w:sz w:val="24"/>
+          <w:szCs w:val="24"/>
+          <w:rtl w:val="0"/>
+        </w:rPr>
+        <w:t xml:space="preserve">Священник:</w:t>
+      </w:r>
+      <w:r>
+        <w:rPr>
+          <w:rFonts w:ascii="Times New Roman" w:cs="Times New Roman" w:eastAsia="Times New Roman" w:hAnsi="Times New Roman"/>
+          <w:sz w:val="24"/>
+          <w:szCs w:val="24"/>
+          <w:rtl w:val="0"/>
         </w:rPr>
         <w:t xml:space="preserve"> Бо милостивий і людинолюбний Бог єси, і Тобі славу возсилаємо, Отцю, і Сину, і Святому Духові, нині, і повсякчас, і на віки віків.</w:t>
       </w:r>
@@ -7810,17 +7357,21 @@
       </w:pPr>
       <w:r>
         <w:rPr>
-          <w:rFonts w:ascii="Times New Roman" w:hAnsi="Times New Roman"/>
-          <w:i/>
-          <w:color w:val="FF0000"/>
-          <w:sz w:val="24"/>
-        </w:rPr>
-        <w:t>Священник:</w:t>
-      </w:r>
-      <w:r>
-        <w:rPr>
-          <w:rFonts w:ascii="Times New Roman" w:hAnsi="Times New Roman"/>
-          <w:sz w:val="24"/>
+          <w:rFonts w:ascii="Times New Roman" w:cs="Times New Roman" w:eastAsia="Times New Roman" w:hAnsi="Times New Roman"/>
+          <w:i w:val="1"/>
+          <w:color w:val="ff0000"/>
+          <w:sz w:val="24"/>
+          <w:szCs w:val="24"/>
+          <w:rtl w:val="0"/>
+        </w:rPr>
+        <w:t xml:space="preserve">Священник:</w:t>
+      </w:r>
+      <w:r>
+        <w:rPr>
+          <w:rFonts w:ascii="Times New Roman" w:cs="Times New Roman" w:eastAsia="Times New Roman" w:hAnsi="Times New Roman"/>
+          <w:sz w:val="24"/>
+          <w:szCs w:val="24"/>
+          <w:rtl w:val="0"/>
         </w:rPr>
         <w:t xml:space="preserve"> Бо Ти – Бог милости, ласк і людинолюбности, і Тобі славу возсилаємо, Отцю, і Сину, і Святому Духові, нині, і повсякчас, і на віки віків.</w:t>
       </w:r>
@@ -7878,17 +7429,21 @@
       </w:pPr>
       <w:r>
         <w:rPr>
-          <w:rFonts w:ascii="Times New Roman" w:hAnsi="Times New Roman"/>
-          <w:i/>
-          <w:color w:val="FF0000"/>
-          <w:sz w:val="24"/>
-        </w:rPr>
-        <w:t>Священник:</w:t>
-      </w:r>
-      <w:r>
-        <w:rPr>
-          <w:rFonts w:ascii="Times New Roman" w:hAnsi="Times New Roman"/>
-          <w:sz w:val="24"/>
+          <w:rFonts w:ascii="Times New Roman" w:cs="Times New Roman" w:eastAsia="Times New Roman" w:hAnsi="Times New Roman"/>
+          <w:i w:val="1"/>
+          <w:color w:val="ff0000"/>
+          <w:sz w:val="24"/>
+          <w:szCs w:val="24"/>
+          <w:rtl w:val="0"/>
+        </w:rPr>
+        <w:t xml:space="preserve">Священник:</w:t>
+      </w:r>
+      <w:r>
+        <w:rPr>
+          <w:rFonts w:ascii="Times New Roman" w:cs="Times New Roman" w:eastAsia="Times New Roman" w:hAnsi="Times New Roman"/>
+          <w:sz w:val="24"/>
+          <w:szCs w:val="24"/>
+          <w:rtl w:val="0"/>
         </w:rPr>
         <w:t xml:space="preserve"> Мир всім.</w:t>
       </w:r>
@@ -8037,17 +7592,21 @@
       </w:pPr>
       <w:r>
         <w:rPr>
-          <w:rFonts w:ascii="Times New Roman" w:hAnsi="Times New Roman"/>
-          <w:i/>
-          <w:color w:val="FF0000"/>
-          <w:sz w:val="24"/>
-        </w:rPr>
-        <w:t>Священник:</w:t>
-      </w:r>
-      <w:r>
-        <w:rPr>
-          <w:rFonts w:ascii="Times New Roman" w:hAnsi="Times New Roman"/>
-          <w:sz w:val="24"/>
+          <w:rFonts w:ascii="Times New Roman" w:cs="Times New Roman" w:eastAsia="Times New Roman" w:hAnsi="Times New Roman"/>
+          <w:i w:val="1"/>
+          <w:color w:val="ff0000"/>
+          <w:sz w:val="24"/>
+          <w:szCs w:val="24"/>
+          <w:rtl w:val="0"/>
+        </w:rPr>
+        <w:t xml:space="preserve">Священник:</w:t>
+      </w:r>
+      <w:r>
+        <w:rPr>
+          <w:rFonts w:ascii="Times New Roman" w:cs="Times New Roman" w:eastAsia="Times New Roman" w:hAnsi="Times New Roman"/>
+          <w:sz w:val="24"/>
+          <w:szCs w:val="24"/>
+          <w:rtl w:val="0"/>
         </w:rPr>
         <w:t xml:space="preserve"> Нехай буде влада царства Твого благословенна і дуже прославлена: Отця, і Сина, і Святого Духа, нині і повсякчас, і на віки віків.</w:t>
       </w:r>
@@ -8686,17 +8245,21 @@
       </w:pPr>
       <w:r>
         <w:rPr>
-          <w:rFonts w:ascii="Times New Roman" w:hAnsi="Times New Roman"/>
-          <w:i/>
-          <w:color w:val="FF0000"/>
-          <w:sz w:val="24"/>
-        </w:rPr>
-        <w:t>Священник:</w:t>
-      </w:r>
-      <w:r>
-        <w:rPr>
-          <w:rFonts w:ascii="Times New Roman" w:hAnsi="Times New Roman"/>
-          <w:sz w:val="24"/>
+          <w:rFonts w:ascii="Times New Roman" w:cs="Times New Roman" w:eastAsia="Times New Roman" w:hAnsi="Times New Roman"/>
+          <w:i w:val="1"/>
+          <w:color w:val="ff0000"/>
+          <w:sz w:val="24"/>
+          <w:szCs w:val="24"/>
+          <w:rtl w:val="0"/>
+        </w:rPr>
+        <w:t xml:space="preserve">Священник:</w:t>
+      </w:r>
+      <w:r>
+        <w:rPr>
+          <w:rFonts w:ascii="Times New Roman" w:cs="Times New Roman" w:eastAsia="Times New Roman" w:hAnsi="Times New Roman"/>
+          <w:sz w:val="24"/>
+          <w:szCs w:val="24"/>
+          <w:rtl w:val="0"/>
         </w:rPr>
         <w:t xml:space="preserve"> Бо Твоє є царство, і сила, і слава, Отця, і Сина, і Святого Духа, нині, і повсякчас, і на віки віків.</w:t>
       </w:r>
@@ -8818,6 +8381,16 @@
       <w:r>
         <w:rPr>
           <w:rFonts w:ascii="Times New Roman" w:cs="Times New Roman" w:eastAsia="Times New Roman" w:hAnsi="Times New Roman"/>
+          <w:b w:val="1"/>
+          <w:sz w:val="24"/>
+          <w:szCs w:val="24"/>
+          <w:rtl w:val="0"/>
+        </w:rPr>
+        <w:t xml:space="preserve">Слава </w:t>
+      </w:r>
+      <w:r>
+        <w:rPr>
+          <w:rFonts w:ascii="Times New Roman" w:cs="Times New Roman" w:eastAsia="Times New Roman" w:hAnsi="Times New Roman"/>
           <w:i w:val="1"/>
           <w:color w:val="ff4400"/>
           <w:sz w:val="24"/>
@@ -8845,44 +8418,69 @@
     <w:p>
       <w:pPr>
         <w:spacing w:after="120" w:line="240" w:lineRule="auto"/>
-        <w:rPr>
-          <w:rFonts w:ascii="Times New Roman" w:cs="Times New Roman" w:eastAsia="Times New Roman" w:hAnsi="Times New Roman"/>
-          <w:sz w:val="24"/>
-          <w:szCs w:val="24"/>
-        </w:rPr>
-      </w:pPr>
-      <w:r>
+        <w:jc w:val="both"/>
         <w:rPr>
           <w:rFonts w:ascii="Times New Roman" w:cs="Times New Roman" w:eastAsia="Times New Roman" w:hAnsi="Times New Roman"/>
           <w:b w:val="1"/>
-          <w:color w:val="000000"/>
-          <w:sz w:val="24"/>
-          <w:szCs w:val="24"/>
-          <w:rtl w:val="0"/>
-        </w:rPr>
-        <w:t xml:space="preserve">І нині: </w:t>
-      </w:r>
-      <w:r>
-        <w:rPr>
-          <w:rFonts w:ascii="Times New Roman" w:cs="Times New Roman" w:eastAsia="Times New Roman" w:hAnsi="Times New Roman"/>
-          <w:i w:val="1"/>
-          <w:color w:val="ff4400"/>
-          <w:sz w:val="24"/>
-          <w:szCs w:val="24"/>
-          <w:rtl w:val="0"/>
-        </w:rPr>
-        <w:t xml:space="preserve">(г. 2): </w:t>
-      </w:r>
-      <w:r>
-        <w:rPr>
-          <w:rFonts w:ascii="Times New Roman" w:cs="Times New Roman" w:eastAsia="Times New Roman" w:hAnsi="Times New Roman"/>
-          <w:color w:val="000000"/>
-          <w:sz w:val="24"/>
-          <w:szCs w:val="24"/>
-          <w:rtl w:val="0"/>
-        </w:rPr>
-        <w:t xml:space="preserve">Вищі понад розум і преславні всі твої таємниці, Богородице!* При ненарушеній чистоті і збереженому дівстві* появилася ти Матір'ю пречистою,* породивши правдивого Бога.* Тож моли його, щоб спаслися душі наші.</w:t>
-      </w:r>
+          <w:sz w:val="24"/>
+          <w:szCs w:val="24"/>
+        </w:rPr>
+      </w:pPr>
+      <w:r>
+        <w:rPr>
+          <w:rFonts w:ascii="Times New Roman" w:cs="Times New Roman" w:eastAsia="Times New Roman" w:hAnsi="Times New Roman"/>
+          <w:b w:val="1"/>
+          <w:sz w:val="24"/>
+          <w:szCs w:val="24"/>
+          <w:rtl w:val="0"/>
+        </w:rPr>
+        <w:t xml:space="preserve">І нині</w:t>
+      </w:r>
+      <w:r>
+        <w:rPr>
+          <w:rFonts w:ascii="Times New Roman" w:cs="Times New Roman" w:eastAsia="Times New Roman" w:hAnsi="Times New Roman"/>
+          <w:sz w:val="24"/>
+          <w:szCs w:val="24"/>
+          <w:rtl w:val="0"/>
+        </w:rPr>
+        <w:t xml:space="preserve"> </w:t>
+      </w:r>
+      <w:r>
+        <w:rPr>
+          <w:rFonts w:ascii="Times New Roman" w:cs="Times New Roman" w:eastAsia="Times New Roman" w:hAnsi="Times New Roman"/>
+          <w:i w:val="1"/>
+          <w:color w:val="ff0000"/>
+          <w:sz w:val="24"/>
+          <w:szCs w:val="24"/>
+          <w:rtl w:val="0"/>
+        </w:rPr>
+        <w:t xml:space="preserve">(г. 4):</w:t>
+      </w:r>
+      <w:r>
+        <w:rPr>
+          <w:rFonts w:ascii="Times New Roman" w:cs="Times New Roman" w:eastAsia="Times New Roman" w:hAnsi="Times New Roman"/>
+          <w:sz w:val="24"/>
+          <w:szCs w:val="24"/>
+          <w:rtl w:val="0"/>
+        </w:rPr>
+        <w:t xml:space="preserve"> Готуйся, Вифлеєме, розкрийся всім, Єдеме,* красуйся, Євфрате,* бо дерево життя в вертепі розквітнуло від Діви.* її лоно раєм мисленним явилось, в якому – божественний сад.* 3 нього, ївши, будемо жити – і не, як Адам, помремо.* Христос раждається, щоб оновити упалий колись образ.</w:t>
+      </w:r>
+      <w:r>
+        <w:rPr>
+          <w:rtl w:val="0"/>
+        </w:rPr>
+      </w:r>
+    </w:p>
+    <w:p>
+      <w:pPr>
+        <w:spacing w:after="120" w:line="240" w:lineRule="auto"/>
+        <w:rPr>
+          <w:rFonts w:ascii="Times New Roman" w:cs="Times New Roman" w:eastAsia="Times New Roman" w:hAnsi="Times New Roman"/>
+          <w:b w:val="1"/>
+          <w:sz w:val="24"/>
+          <w:szCs w:val="24"/>
+        </w:rPr>
+      </w:pPr>
       <w:r>
         <w:rPr>
           <w:rtl w:val="0"/>
@@ -9002,17 +8600,21 @@
       </w:pPr>
       <w:r>
         <w:rPr>
-          <w:rFonts w:ascii="Times New Roman" w:hAnsi="Times New Roman"/>
-          <w:i/>
-          <w:color w:val="FF0000"/>
-          <w:sz w:val="24"/>
-        </w:rPr>
-        <w:t>Священник:</w:t>
-      </w:r>
-      <w:r>
-        <w:rPr>
-          <w:rFonts w:ascii="Times New Roman" w:hAnsi="Times New Roman"/>
-          <w:sz w:val="24"/>
+          <w:rFonts w:ascii="Times New Roman" w:cs="Times New Roman" w:eastAsia="Times New Roman" w:hAnsi="Times New Roman"/>
+          <w:i w:val="1"/>
+          <w:color w:val="ff0000"/>
+          <w:sz w:val="24"/>
+          <w:szCs w:val="24"/>
+          <w:rtl w:val="0"/>
+        </w:rPr>
+        <w:t xml:space="preserve">Священник:</w:t>
+      </w:r>
+      <w:r>
+        <w:rPr>
+          <w:rFonts w:ascii="Times New Roman" w:cs="Times New Roman" w:eastAsia="Times New Roman" w:hAnsi="Times New Roman"/>
+          <w:sz w:val="24"/>
+          <w:szCs w:val="24"/>
+          <w:rtl w:val="0"/>
         </w:rPr>
         <w:t xml:space="preserve"> Благослове́нний Христо́с Бог наш, за́вжди, ни́ні, і повсякча́с, і на ві́ки вікі́в.</w:t>
       </w:r>
@@ -9068,17 +8670,21 @@
       </w:pPr>
       <w:r>
         <w:rPr>
-          <w:rFonts w:ascii="Times New Roman" w:hAnsi="Times New Roman"/>
-          <w:i/>
-          <w:color w:val="FF0000"/>
-          <w:sz w:val="24"/>
-        </w:rPr>
-        <w:t>Священник:</w:t>
-      </w:r>
-      <w:r>
-        <w:rPr>
-          <w:rFonts w:ascii="Times New Roman" w:hAnsi="Times New Roman"/>
-          <w:sz w:val="24"/>
+          <w:rFonts w:ascii="Times New Roman" w:cs="Times New Roman" w:eastAsia="Times New Roman" w:hAnsi="Times New Roman"/>
+          <w:i w:val="1"/>
+          <w:color w:val="ff0000"/>
+          <w:sz w:val="24"/>
+          <w:szCs w:val="24"/>
+          <w:rtl w:val="0"/>
+        </w:rPr>
+        <w:t xml:space="preserve">Священник:</w:t>
+      </w:r>
+      <w:r>
+        <w:rPr>
+          <w:rFonts w:ascii="Times New Roman" w:cs="Times New Roman" w:eastAsia="Times New Roman" w:hAnsi="Times New Roman"/>
+          <w:sz w:val="24"/>
+          <w:szCs w:val="24"/>
+          <w:rtl w:val="0"/>
         </w:rPr>
         <w:t xml:space="preserve"> Пресвята́ Богоро́дице, спаси́ нас.</w:t>
       </w:r>
@@ -9134,17 +8740,21 @@
       </w:pPr>
       <w:r>
         <w:rPr>
-          <w:rFonts w:ascii="Times New Roman" w:hAnsi="Times New Roman"/>
-          <w:i/>
-          <w:color w:val="FF0000"/>
-          <w:sz w:val="24"/>
-        </w:rPr>
-        <w:t>Священник:</w:t>
-      </w:r>
-      <w:r>
-        <w:rPr>
-          <w:rFonts w:ascii="Times New Roman" w:hAnsi="Times New Roman"/>
-          <w:sz w:val="24"/>
+          <w:rFonts w:ascii="Times New Roman" w:cs="Times New Roman" w:eastAsia="Times New Roman" w:hAnsi="Times New Roman"/>
+          <w:i w:val="1"/>
+          <w:color w:val="ff0000"/>
+          <w:sz w:val="24"/>
+          <w:szCs w:val="24"/>
+          <w:rtl w:val="0"/>
+        </w:rPr>
+        <w:t xml:space="preserve">Священник:</w:t>
+      </w:r>
+      <w:r>
+        <w:rPr>
+          <w:rFonts w:ascii="Times New Roman" w:cs="Times New Roman" w:eastAsia="Times New Roman" w:hAnsi="Times New Roman"/>
+          <w:sz w:val="24"/>
+          <w:szCs w:val="24"/>
+          <w:rtl w:val="0"/>
         </w:rPr>
         <w:t xml:space="preserve"> Сла́ва Тобі́, Хри́сте Бо́же, упова́ння на́ше, сла́ва Тобі́!</w:t>
       </w:r>
@@ -9211,39 +8821,53 @@
     </w:p>
     <w:p>
       <w:pPr>
-        <w:spacing w:after="120"/>
-      </w:pPr>
-      <w:r>
-        <w:rPr>
-          <w:rFonts w:ascii="Times New Roman" w:hAnsi="Times New Roman"/>
-          <w:i/>
-          <w:color w:val="FF0000"/>
-          <w:sz w:val="24"/>
-        </w:rPr>
-        <w:t>Священник:</w:t>
-      </w:r>
-      <w:r>
-        <w:rPr>
-          <w:rFonts w:ascii="Times New Roman" w:hAnsi="Times New Roman"/>
-          <w:sz w:val="24"/>
+        <w:spacing w:after="120" w:lineRule="auto"/>
+        <w:rPr/>
+      </w:pPr>
+      <w:r>
+        <w:rPr>
+          <w:rFonts w:ascii="Times New Roman" w:cs="Times New Roman" w:eastAsia="Times New Roman" w:hAnsi="Times New Roman"/>
+          <w:i w:val="1"/>
+          <w:color w:val="ff0000"/>
+          <w:sz w:val="24"/>
+          <w:szCs w:val="24"/>
+          <w:rtl w:val="0"/>
+        </w:rPr>
+        <w:t xml:space="preserve">Священник:</w:t>
+      </w:r>
+      <w:r>
+        <w:rPr>
+          <w:rFonts w:ascii="Times New Roman" w:cs="Times New Roman" w:eastAsia="Times New Roman" w:hAnsi="Times New Roman"/>
+          <w:sz w:val="24"/>
+          <w:szCs w:val="24"/>
+          <w:rtl w:val="0"/>
         </w:rPr>
         <w:t xml:space="preserve"> Христос, що воскрес із мертвих, істинний Бог наш - молитвами пречистої Своєї Матері, святих славних і всехвальних апостолів, і святого, </w:t>
       </w:r>
       <w:r>
         <w:rPr>
-          <w:rFonts w:ascii="Times New Roman" w:hAnsi="Times New Roman"/>
-          <w:i/>
-          <w:color w:val="FF0000"/>
-          <w:sz w:val="24"/>
-        </w:rPr>
-        <w:t>якого є храм</w:t>
-      </w:r>
-      <w:r>
-        <w:rPr>
-          <w:rFonts w:ascii="Times New Roman" w:hAnsi="Times New Roman"/>
-          <w:sz w:val="24"/>
-        </w:rPr>
-        <w:t>, і святої великомучениці Анастасії, і всіх святих - помилує і спасе нас як благий і людинолюбний.</w:t>
+          <w:rFonts w:ascii="Times New Roman" w:cs="Times New Roman" w:eastAsia="Times New Roman" w:hAnsi="Times New Roman"/>
+          <w:i w:val="1"/>
+          <w:color w:val="ff0000"/>
+          <w:sz w:val="24"/>
+          <w:szCs w:val="24"/>
+          <w:rtl w:val="0"/>
+        </w:rPr>
+        <w:t xml:space="preserve">якого є храм</w:t>
+      </w:r>
+      <w:r>
+        <w:rPr>
+          <w:rFonts w:ascii="Times New Roman" w:cs="Times New Roman" w:eastAsia="Times New Roman" w:hAnsi="Times New Roman"/>
+          <w:sz w:val="24"/>
+          <w:szCs w:val="24"/>
+          <w:rtl w:val="0"/>
+        </w:rPr>
+        <w:t xml:space="preserve">, і святої великомучениці Анастасії, і всіх святих - помилує і спасе нас як благий і людинолюбний.</w:t>
+      </w:r>
+      <w:r>
+        <w:rPr>
+          <w:rtl w:val="0"/>
+        </w:rPr>
       </w:r>
     </w:p>
     <w:p>
@@ -9439,17 +9063,21 @@
       </w:pPr>
       <w:r>
         <w:rPr>
-          <w:rFonts w:ascii="Times New Roman" w:hAnsi="Times New Roman"/>
-          <w:i/>
-          <w:color w:val="FF0000"/>
-          <w:sz w:val="24"/>
-        </w:rPr>
-        <w:t>Священник:</w:t>
-      </w:r>
-      <w:r>
-        <w:rPr>
-          <w:rFonts w:ascii="Times New Roman" w:hAnsi="Times New Roman"/>
-          <w:sz w:val="24"/>
+          <w:rFonts w:ascii="Times New Roman" w:cs="Times New Roman" w:eastAsia="Times New Roman" w:hAnsi="Times New Roman"/>
+          <w:i w:val="1"/>
+          <w:color w:val="ff0000"/>
+          <w:sz w:val="24"/>
+          <w:szCs w:val="24"/>
+          <w:rtl w:val="0"/>
+        </w:rPr>
+        <w:t xml:space="preserve">Священник:</w:t>
+      </w:r>
+      <w:r>
+        <w:rPr>
+          <w:rFonts w:ascii="Times New Roman" w:cs="Times New Roman" w:eastAsia="Times New Roman" w:hAnsi="Times New Roman"/>
+          <w:sz w:val="24"/>
+          <w:szCs w:val="24"/>
+          <w:rtl w:val="0"/>
         </w:rPr>
         <w:t xml:space="preserve"> Слава святій, одноістотній, животворчій і нероздільній Тройці, завжди, нині і повсякчас, і на віки віків.</w:t>
       </w:r>
@@ -13600,17 +13228,21 @@
       </w:pPr>
       <w:r>
         <w:rPr>
-          <w:rFonts w:ascii="Times New Roman" w:hAnsi="Times New Roman"/>
-          <w:i/>
-          <w:color w:val="FF0000"/>
-          <w:sz w:val="24"/>
-        </w:rPr>
-        <w:t>Священник:</w:t>
-      </w:r>
-      <w:r>
-        <w:rPr>
-          <w:rFonts w:ascii="Times New Roman" w:hAnsi="Times New Roman"/>
-          <w:sz w:val="24"/>
+          <w:rFonts w:ascii="Times New Roman" w:cs="Times New Roman" w:eastAsia="Times New Roman" w:hAnsi="Times New Roman"/>
+          <w:i w:val="1"/>
+          <w:color w:val="ff0000"/>
+          <w:sz w:val="24"/>
+          <w:szCs w:val="24"/>
+          <w:rtl w:val="0"/>
+        </w:rPr>
+        <w:t xml:space="preserve">Священник:</w:t>
+      </w:r>
+      <w:r>
+        <w:rPr>
+          <w:rFonts w:ascii="Times New Roman" w:cs="Times New Roman" w:eastAsia="Times New Roman" w:hAnsi="Times New Roman"/>
+          <w:sz w:val="24"/>
+          <w:szCs w:val="24"/>
+          <w:rtl w:val="0"/>
         </w:rPr>
         <w:t xml:space="preserve"> Бо Тобі належить усяка слава, честь і поклоніння, Отцю, і Сину, і Святому Духові, нині, і повсякчас, і на віки віків.</w:t>
       </w:r>
@@ -14034,6 +13666,16 @@
       <w:r>
         <w:rPr>
           <w:rFonts w:ascii="Times New Roman" w:cs="Times New Roman" w:eastAsia="Times New Roman" w:hAnsi="Times New Roman"/>
+          <w:b w:val="1"/>
+          <w:sz w:val="24"/>
+          <w:szCs w:val="24"/>
+          <w:rtl w:val="0"/>
+        </w:rPr>
+        <w:t xml:space="preserve">Слава </w:t>
+      </w:r>
+      <w:r>
+        <w:rPr>
+          <w:rFonts w:ascii="Times New Roman" w:cs="Times New Roman" w:eastAsia="Times New Roman" w:hAnsi="Times New Roman"/>
           <w:i w:val="1"/>
           <w:color w:val="ff4400"/>
           <w:sz w:val="24"/>
@@ -14061,43 +13703,52 @@
     <w:p>
       <w:pPr>
         <w:spacing w:after="120" w:line="240" w:lineRule="auto"/>
-        <w:rPr>
-          <w:rFonts w:ascii="Times New Roman" w:cs="Times New Roman" w:eastAsia="Times New Roman" w:hAnsi="Times New Roman"/>
-          <w:sz w:val="24"/>
-          <w:szCs w:val="24"/>
-        </w:rPr>
-      </w:pPr>
-      <w:r>
+        <w:jc w:val="both"/>
         <w:rPr>
           <w:rFonts w:ascii="Times New Roman" w:cs="Times New Roman" w:eastAsia="Times New Roman" w:hAnsi="Times New Roman"/>
           <w:b w:val="1"/>
-          <w:color w:val="000000"/>
-          <w:sz w:val="24"/>
-          <w:szCs w:val="24"/>
-          <w:rtl w:val="0"/>
-        </w:rPr>
-        <w:t xml:space="preserve">І нині: </w:t>
-      </w:r>
-      <w:r>
-        <w:rPr>
-          <w:rFonts w:ascii="Times New Roman" w:cs="Times New Roman" w:eastAsia="Times New Roman" w:hAnsi="Times New Roman"/>
-          <w:i w:val="1"/>
-          <w:color w:val="ff4400"/>
-          <w:sz w:val="24"/>
-          <w:szCs w:val="24"/>
-          <w:rtl w:val="0"/>
-        </w:rPr>
-        <w:t xml:space="preserve">(г. 2): </w:t>
-      </w:r>
-      <w:r>
-        <w:rPr>
-          <w:rFonts w:ascii="Times New Roman" w:cs="Times New Roman" w:eastAsia="Times New Roman" w:hAnsi="Times New Roman"/>
-          <w:color w:val="000000"/>
-          <w:sz w:val="24"/>
-          <w:szCs w:val="24"/>
-          <w:rtl w:val="0"/>
-        </w:rPr>
-        <w:t xml:space="preserve">Вищі понад розум і преславні всі твої таємниці, Богородице!* При ненарушеній чистоті і збереженому дівстві* появилася ти Матір'ю пречистою,* народивши правдивого Бога.* Тож моли його, щоб спаслися душі наші.</w:t>
+          <w:sz w:val="24"/>
+          <w:szCs w:val="24"/>
+        </w:rPr>
+      </w:pPr>
+      <w:r>
+        <w:rPr>
+          <w:rFonts w:ascii="Times New Roman" w:cs="Times New Roman" w:eastAsia="Times New Roman" w:hAnsi="Times New Roman"/>
+          <w:b w:val="1"/>
+          <w:sz w:val="24"/>
+          <w:szCs w:val="24"/>
+          <w:rtl w:val="0"/>
+        </w:rPr>
+        <w:t xml:space="preserve">І нині</w:t>
+      </w:r>
+      <w:r>
+        <w:rPr>
+          <w:rFonts w:ascii="Times New Roman" w:cs="Times New Roman" w:eastAsia="Times New Roman" w:hAnsi="Times New Roman"/>
+          <w:sz w:val="24"/>
+          <w:szCs w:val="24"/>
+          <w:rtl w:val="0"/>
+        </w:rPr>
+        <w:t xml:space="preserve"> </w:t>
+      </w:r>
+      <w:r>
+        <w:rPr>
+          <w:rFonts w:ascii="Times New Roman" w:cs="Times New Roman" w:eastAsia="Times New Roman" w:hAnsi="Times New Roman"/>
+          <w:i w:val="1"/>
+          <w:color w:val="ff0000"/>
+          <w:sz w:val="24"/>
+          <w:szCs w:val="24"/>
+          <w:rtl w:val="0"/>
+        </w:rPr>
+        <w:t xml:space="preserve">(г. 4):</w:t>
+      </w:r>
+      <w:r>
+        <w:rPr>
+          <w:rFonts w:ascii="Times New Roman" w:cs="Times New Roman" w:eastAsia="Times New Roman" w:hAnsi="Times New Roman"/>
+          <w:sz w:val="24"/>
+          <w:szCs w:val="24"/>
+          <w:rtl w:val="0"/>
+        </w:rPr>
+        <w:t xml:space="preserve"> Готуйся, Вифлеєме, розкрийся всім, Єдеме,* красуйся, Євфрате,* бо дерево життя в вертепі розквітнуло від Діви.* її лоно раєм мисленним явилось, в якому – божественний сад.* 3 нього, ївши, будемо жити – і не, як Адам, помремо.* Христос раждається, щоб оновити упалий колись образ.</w:t>
       </w:r>
       <w:r>
         <w:rPr>
@@ -14362,17 +14013,21 @@
       </w:pPr>
       <w:r>
         <w:rPr>
-          <w:rFonts w:ascii="Times New Roman" w:hAnsi="Times New Roman"/>
-          <w:i/>
-          <w:color w:val="FF0000"/>
-          <w:sz w:val="24"/>
-        </w:rPr>
-        <w:t>Священник:</w:t>
-      </w:r>
-      <w:r>
-        <w:rPr>
-          <w:rFonts w:ascii="Times New Roman" w:hAnsi="Times New Roman"/>
-          <w:sz w:val="24"/>
+          <w:rFonts w:ascii="Times New Roman" w:cs="Times New Roman" w:eastAsia="Times New Roman" w:hAnsi="Times New Roman"/>
+          <w:i w:val="1"/>
+          <w:color w:val="ff0000"/>
+          <w:sz w:val="24"/>
+          <w:szCs w:val="24"/>
+          <w:rtl w:val="0"/>
+        </w:rPr>
+        <w:t xml:space="preserve">Священник:</w:t>
+      </w:r>
+      <w:r>
+        <w:rPr>
+          <w:rFonts w:ascii="Times New Roman" w:cs="Times New Roman" w:eastAsia="Times New Roman" w:hAnsi="Times New Roman"/>
+          <w:sz w:val="24"/>
+          <w:szCs w:val="24"/>
+          <w:rtl w:val="0"/>
         </w:rPr>
         <w:t xml:space="preserve"> Бо Твоя є влада і Твоє є царство, і сила, і слава, Отця, і Сина, і Святого Духа, нині, і повсякчас, і на віки віків.</w:t>
       </w:r>
@@ -14774,17 +14429,21 @@
       </w:pPr>
       <w:r>
         <w:rPr>
-          <w:rFonts w:ascii="Times New Roman" w:hAnsi="Times New Roman"/>
-          <w:i/>
-          <w:color w:val="FF0000"/>
-          <w:sz w:val="24"/>
-        </w:rPr>
-        <w:t>Священник:</w:t>
-      </w:r>
-      <w:r>
-        <w:rPr>
-          <w:rFonts w:ascii="Times New Roman" w:hAnsi="Times New Roman"/>
-          <w:sz w:val="24"/>
+          <w:rFonts w:ascii="Times New Roman" w:cs="Times New Roman" w:eastAsia="Times New Roman" w:hAnsi="Times New Roman"/>
+          <w:i w:val="1"/>
+          <w:color w:val="ff0000"/>
+          <w:sz w:val="24"/>
+          <w:szCs w:val="24"/>
+          <w:rtl w:val="0"/>
+        </w:rPr>
+        <w:t xml:space="preserve">Священник:</w:t>
+      </w:r>
+      <w:r>
+        <w:rPr>
+          <w:rFonts w:ascii="Times New Roman" w:cs="Times New Roman" w:eastAsia="Times New Roman" w:hAnsi="Times New Roman"/>
+          <w:sz w:val="24"/>
+          <w:szCs w:val="24"/>
+          <w:rtl w:val="0"/>
         </w:rPr>
         <w:t xml:space="preserve"> Бо Ти благий і людинолюбний Бог – і Тобі славу возсилаємо, Отцю, і Сину, і Святому Духові, нині, і повсякчас, і на віки віків.</w:t>
       </w:r>
@@ -16058,17 +15717,21 @@
       </w:pPr>
       <w:r>
         <w:rPr>
-          <w:rFonts w:ascii="Times New Roman" w:hAnsi="Times New Roman"/>
-          <w:i/>
-          <w:color w:val="FF0000"/>
-          <w:sz w:val="24"/>
-        </w:rPr>
-        <w:t>Священник:</w:t>
-      </w:r>
-      <w:r>
-        <w:rPr>
-          <w:rFonts w:ascii="Times New Roman" w:hAnsi="Times New Roman"/>
-          <w:sz w:val="24"/>
+          <w:rFonts w:ascii="Times New Roman" w:cs="Times New Roman" w:eastAsia="Times New Roman" w:hAnsi="Times New Roman"/>
+          <w:i w:val="1"/>
+          <w:color w:val="ff0000"/>
+          <w:sz w:val="24"/>
+          <w:szCs w:val="24"/>
+          <w:rtl w:val="0"/>
+        </w:rPr>
+        <w:t xml:space="preserve">Священник:</w:t>
+      </w:r>
+      <w:r>
+        <w:rPr>
+          <w:rFonts w:ascii="Times New Roman" w:cs="Times New Roman" w:eastAsia="Times New Roman" w:hAnsi="Times New Roman"/>
+          <w:sz w:val="24"/>
+          <w:szCs w:val="24"/>
+          <w:rtl w:val="0"/>
         </w:rPr>
         <w:t xml:space="preserve"> Бо благословилося ім'я Твоє і прославилося царство Твоє, Отця, і Сина, і Святого Духа, нині і повсякчас, і на віки віків.</w:t>
       </w:r>
@@ -16634,17 +16297,21 @@
       </w:pPr>
       <w:r>
         <w:rPr>
-          <w:rFonts w:ascii="Times New Roman" w:hAnsi="Times New Roman"/>
-          <w:i/>
-          <w:color w:val="FF0000"/>
-          <w:sz w:val="24"/>
-        </w:rPr>
-        <w:t>Священник:</w:t>
-      </w:r>
-      <w:r>
-        <w:rPr>
-          <w:rFonts w:ascii="Times New Roman" w:hAnsi="Times New Roman"/>
-          <w:sz w:val="24"/>
+          <w:rFonts w:ascii="Times New Roman" w:cs="Times New Roman" w:eastAsia="Times New Roman" w:hAnsi="Times New Roman"/>
+          <w:i w:val="1"/>
+          <w:color w:val="ff0000"/>
+          <w:sz w:val="24"/>
+          <w:szCs w:val="24"/>
+          <w:rtl w:val="0"/>
+        </w:rPr>
+        <w:t xml:space="preserve">Священник:</w:t>
+      </w:r>
+      <w:r>
+        <w:rPr>
+          <w:rFonts w:ascii="Times New Roman" w:cs="Times New Roman" w:eastAsia="Times New Roman" w:hAnsi="Times New Roman"/>
+          <w:sz w:val="24"/>
+          <w:szCs w:val="24"/>
+          <w:rtl w:val="0"/>
         </w:rPr>
         <w:t xml:space="preserve"> Мир всім.</w:t>
       </w:r>
@@ -16912,17 +16579,21 @@
       </w:pPr>
       <w:r>
         <w:rPr>
-          <w:rFonts w:ascii="Times New Roman" w:hAnsi="Times New Roman"/>
-          <w:i/>
-          <w:color w:val="FF0000"/>
-          <w:sz w:val="24"/>
-        </w:rPr>
-        <w:t>Священник:</w:t>
-      </w:r>
-      <w:r>
-        <w:rPr>
-          <w:rFonts w:ascii="Times New Roman" w:hAnsi="Times New Roman"/>
-          <w:sz w:val="24"/>
+          <w:rFonts w:ascii="Times New Roman" w:cs="Times New Roman" w:eastAsia="Times New Roman" w:hAnsi="Times New Roman"/>
+          <w:i w:val="1"/>
+          <w:color w:val="ff0000"/>
+          <w:sz w:val="24"/>
+          <w:szCs w:val="24"/>
+          <w:rtl w:val="0"/>
+        </w:rPr>
+        <w:t xml:space="preserve">Священник:</w:t>
+      </w:r>
+      <w:r>
+        <w:rPr>
+          <w:rFonts w:ascii="Times New Roman" w:cs="Times New Roman" w:eastAsia="Times New Roman" w:hAnsi="Times New Roman"/>
+          <w:sz w:val="24"/>
+          <w:szCs w:val="24"/>
+          <w:rtl w:val="0"/>
         </w:rPr>
         <w:t xml:space="preserve"> Бо Ти святий єси, Боже наш, і в святині перебуваєш, і ми Тобі славу возсилаємо: Отцю, і Сину, і Святому Духові, нині і повсякчас, і на віки віків.</w:t>
       </w:r>
@@ -17200,7 +16871,7 @@
           <w:szCs w:val="24"/>
           <w:rtl w:val="0"/>
         </w:rPr>
-        <w:t>(3 р.)</w:t>
+        <w:t xml:space="preserve">(3 р.)</w:t>
       </w:r>
       <w:r>
         <w:rPr>
@@ -17250,17 +16921,21 @@
       </w:pPr>
       <w:r>
         <w:rPr>
-          <w:rFonts w:ascii="Times New Roman" w:hAnsi="Times New Roman"/>
-          <w:i/>
-          <w:color w:val="FF0000"/>
-          <w:sz w:val="24"/>
-        </w:rPr>
-        <w:t>Священник:</w:t>
-      </w:r>
-      <w:r>
-        <w:rPr>
-          <w:rFonts w:ascii="Times New Roman" w:hAnsi="Times New Roman"/>
-          <w:sz w:val="24"/>
+          <w:rFonts w:ascii="Times New Roman" w:cs="Times New Roman" w:eastAsia="Times New Roman" w:hAnsi="Times New Roman"/>
+          <w:i w:val="1"/>
+          <w:color w:val="ff0000"/>
+          <w:sz w:val="24"/>
+          <w:szCs w:val="24"/>
+          <w:rtl w:val="0"/>
+        </w:rPr>
+        <w:t xml:space="preserve">Священник:</w:t>
+      </w:r>
+      <w:r>
+        <w:rPr>
+          <w:rFonts w:ascii="Times New Roman" w:cs="Times New Roman" w:eastAsia="Times New Roman" w:hAnsi="Times New Roman"/>
+          <w:sz w:val="24"/>
+          <w:szCs w:val="24"/>
+          <w:rtl w:val="0"/>
         </w:rPr>
         <w:t xml:space="preserve"> Мир всім!</w:t>
       </w:r>
@@ -17308,17 +16983,21 @@
       </w:pPr>
       <w:r>
         <w:rPr>
-          <w:rFonts w:ascii="Times New Roman" w:hAnsi="Times New Roman"/>
-          <w:i/>
-          <w:color w:val="FF0000"/>
-          <w:sz w:val="24"/>
-        </w:rPr>
-        <w:t>Священник:</w:t>
-      </w:r>
-      <w:r>
-        <w:rPr>
-          <w:rFonts w:ascii="Times New Roman" w:hAnsi="Times New Roman"/>
-          <w:sz w:val="24"/>
+          <w:rFonts w:ascii="Times New Roman" w:cs="Times New Roman" w:eastAsia="Times New Roman" w:hAnsi="Times New Roman"/>
+          <w:i w:val="1"/>
+          <w:color w:val="ff0000"/>
+          <w:sz w:val="24"/>
+          <w:szCs w:val="24"/>
+          <w:rtl w:val="0"/>
+        </w:rPr>
+        <w:t xml:space="preserve">Священник:</w:t>
+      </w:r>
+      <w:r>
+        <w:rPr>
+          <w:rFonts w:ascii="Times New Roman" w:cs="Times New Roman" w:eastAsia="Times New Roman" w:hAnsi="Times New Roman"/>
+          <w:sz w:val="24"/>
+          <w:szCs w:val="24"/>
+          <w:rtl w:val="0"/>
         </w:rPr>
         <w:t xml:space="preserve"> Від Луки святого Євангелія читання.</w:t>
       </w:r>
@@ -18363,17 +18042,21 @@
       </w:pPr>
       <w:r>
         <w:rPr>
-          <w:rFonts w:ascii="Times New Roman" w:hAnsi="Times New Roman"/>
-          <w:i/>
-          <w:color w:val="FF0000"/>
-          <w:sz w:val="24"/>
-        </w:rPr>
-        <w:t>Священник:</w:t>
-      </w:r>
-      <w:r>
-        <w:rPr>
-          <w:rFonts w:ascii="Times New Roman" w:hAnsi="Times New Roman"/>
-          <w:sz w:val="24"/>
+          <w:rFonts w:ascii="Times New Roman" w:cs="Times New Roman" w:eastAsia="Times New Roman" w:hAnsi="Times New Roman"/>
+          <w:i w:val="1"/>
+          <w:color w:val="ff0000"/>
+          <w:sz w:val="24"/>
+          <w:szCs w:val="24"/>
+          <w:rtl w:val="0"/>
+        </w:rPr>
+        <w:t xml:space="preserve">Священник:</w:t>
+      </w:r>
+      <w:r>
+        <w:rPr>
+          <w:rFonts w:ascii="Times New Roman" w:cs="Times New Roman" w:eastAsia="Times New Roman" w:hAnsi="Times New Roman"/>
+          <w:sz w:val="24"/>
+          <w:szCs w:val="24"/>
+          <w:rtl w:val="0"/>
         </w:rPr>
         <w:t xml:space="preserve"> Благодаттю, і щедротами, і людинолюб’ям єдинородного Сина Твого, з яким Ти благословенний, із пресвятим, і благим, і животворчим твоїм Духом, нині, і повсякчас, і на віки віків.</w:t>
       </w:r>
@@ -18483,7 +18166,7 @@
           <w:szCs w:val="24"/>
           <w:rtl w:val="0"/>
         </w:rPr>
-        <w:t>Ірмос 1</w:t>
+        <w:t xml:space="preserve">Ірмос 1</w:t>
       </w:r>
       <w:r>
         <w:rPr>
@@ -18855,7 +18538,7 @@
           <w:szCs w:val="24"/>
           <w:rtl w:val="0"/>
         </w:rPr>
-        <w:t>Ірмос 3</w:t>
+        <w:t xml:space="preserve">Ірмос 3</w:t>
       </w:r>
       <w:r>
         <w:rPr>
@@ -19644,17 +19327,21 @@
       </w:pPr>
       <w:r>
         <w:rPr>
-          <w:rFonts w:ascii="Times New Roman" w:hAnsi="Times New Roman"/>
-          <w:i/>
-          <w:color w:val="FF0000"/>
-          <w:sz w:val="24"/>
-        </w:rPr>
-        <w:t>Священник:</w:t>
-      </w:r>
-      <w:r>
-        <w:rPr>
-          <w:rFonts w:ascii="Times New Roman" w:hAnsi="Times New Roman"/>
-          <w:sz w:val="24"/>
+          <w:rFonts w:ascii="Times New Roman" w:cs="Times New Roman" w:eastAsia="Times New Roman" w:hAnsi="Times New Roman"/>
+          <w:i w:val="1"/>
+          <w:color w:val="ff0000"/>
+          <w:sz w:val="24"/>
+          <w:szCs w:val="24"/>
+          <w:rtl w:val="0"/>
+        </w:rPr>
+        <w:t xml:space="preserve">Священник:</w:t>
+      </w:r>
+      <w:r>
+        <w:rPr>
+          <w:rFonts w:ascii="Times New Roman" w:cs="Times New Roman" w:eastAsia="Times New Roman" w:hAnsi="Times New Roman"/>
+          <w:sz w:val="24"/>
+          <w:szCs w:val="24"/>
+          <w:rtl w:val="0"/>
         </w:rPr>
         <w:t xml:space="preserve"> Бо Ти Бог наш і Тобі славу возсилаємо: Отцю, і Сину, і Святому Духові, нині, і повсякчас, і на віки віків.</w:t>
       </w:r>
@@ -19736,7 +19423,7 @@
           <w:szCs w:val="24"/>
           <w:rtl w:val="0"/>
         </w:rPr>
-        <w:t>Ірмос 4</w:t>
+        <w:t xml:space="preserve">Ірмос 4</w:t>
       </w:r>
       <w:r>
         <w:rPr>
@@ -20112,7 +19799,7 @@
           <w:szCs w:val="24"/>
           <w:rtl w:val="0"/>
         </w:rPr>
-        <w:t>Ірмос 5</w:t>
+        <w:t xml:space="preserve">Ірмос 5</w:t>
       </w:r>
       <w:r>
         <w:rPr>
@@ -20478,7 +20165,7 @@
           <w:szCs w:val="24"/>
           <w:rtl w:val="0"/>
         </w:rPr>
-        <w:t>Ірмос 6</w:t>
+        <w:t xml:space="preserve">Ірмос 6</w:t>
       </w:r>
       <w:r>
         <w:rPr>
@@ -21067,17 +20754,21 @@
       </w:pPr>
       <w:r>
         <w:rPr>
-          <w:rFonts w:ascii="Times New Roman" w:hAnsi="Times New Roman"/>
-          <w:i/>
-          <w:color w:val="FF0000"/>
-          <w:sz w:val="24"/>
-        </w:rPr>
-        <w:t>Священник:</w:t>
-      </w:r>
-      <w:r>
-        <w:rPr>
-          <w:rFonts w:ascii="Times New Roman" w:hAnsi="Times New Roman"/>
-          <w:sz w:val="24"/>
+          <w:rFonts w:ascii="Times New Roman" w:cs="Times New Roman" w:eastAsia="Times New Roman" w:hAnsi="Times New Roman"/>
+          <w:i w:val="1"/>
+          <w:color w:val="ff0000"/>
+          <w:sz w:val="24"/>
+          <w:szCs w:val="24"/>
+          <w:rtl w:val="0"/>
+        </w:rPr>
+        <w:t xml:space="preserve">Священник:</w:t>
+      </w:r>
+      <w:r>
+        <w:rPr>
+          <w:rFonts w:ascii="Times New Roman" w:cs="Times New Roman" w:eastAsia="Times New Roman" w:hAnsi="Times New Roman"/>
+          <w:sz w:val="24"/>
+          <w:szCs w:val="24"/>
+          <w:rtl w:val="0"/>
         </w:rPr>
         <w:t xml:space="preserve"> Бо Ти цар миру і Спас душ наших – і Тобі славу возсилаємо, Отцю, і Сину, і Святому Духові, нині, і повсякчас, і на віки віків.</w:t>
       </w:r>
@@ -21206,7 +20897,7 @@
           <w:szCs w:val="24"/>
           <w:rtl w:val="0"/>
         </w:rPr>
-        <w:t>Ірмос 7</w:t>
+        <w:t xml:space="preserve">Ірмос 7</w:t>
       </w:r>
       <w:r>
         <w:rPr>
@@ -21581,7 +21272,7 @@
           <w:szCs w:val="24"/>
           <w:rtl w:val="0"/>
         </w:rPr>
-        <w:t>Ірмос 8</w:t>
+        <w:t xml:space="preserve">Ірмос 8</w:t>
       </w:r>
       <w:r>
         <w:rPr>
@@ -22201,7 +21892,7 @@
           <w:szCs w:val="24"/>
           <w:rtl w:val="0"/>
         </w:rPr>
-        <w:t>Ірмос (г. 1):</w:t>
+        <w:t xml:space="preserve">Ірмос (г. 1):</w:t>
       </w:r>
       <w:r>
         <w:rPr>
@@ -24154,7 +23845,7 @@
           <w:szCs w:val="24"/>
           <w:rtl w:val="0"/>
         </w:rPr>
-        <w:t>(г. 4, подібний: Покликаний був ти):</w:t>
+        <w:t xml:space="preserve">(г. 4, подібний: Покликаний був ти):</w:t>
       </w:r>
       <w:sdt>
         <w:sdtPr>
@@ -24554,17 +24245,21 @@
       </w:pPr>
       <w:r>
         <w:rPr>
-          <w:rFonts w:ascii="Times New Roman" w:hAnsi="Times New Roman"/>
-          <w:i/>
-          <w:color w:val="FF0000"/>
-          <w:sz w:val="24"/>
-        </w:rPr>
-        <w:t>Священник:</w:t>
-      </w:r>
-      <w:r>
-        <w:rPr>
-          <w:rFonts w:ascii="Times New Roman" w:hAnsi="Times New Roman"/>
-          <w:sz w:val="24"/>
+          <w:rFonts w:ascii="Times New Roman" w:cs="Times New Roman" w:eastAsia="Times New Roman" w:hAnsi="Times New Roman"/>
+          <w:i w:val="1"/>
+          <w:color w:val="ff0000"/>
+          <w:sz w:val="24"/>
+          <w:szCs w:val="24"/>
+          <w:rtl w:val="0"/>
+        </w:rPr>
+        <w:t xml:space="preserve">Священник:</w:t>
+      </w:r>
+      <w:r>
+        <w:rPr>
+          <w:rFonts w:ascii="Times New Roman" w:cs="Times New Roman" w:eastAsia="Times New Roman" w:hAnsi="Times New Roman"/>
+          <w:sz w:val="24"/>
+          <w:szCs w:val="24"/>
+          <w:rtl w:val="0"/>
         </w:rPr>
         <w:t xml:space="preserve"> Слава Тобі, що Світло нам показав! </w:t>
       </w:r>
@@ -25503,17 +25198,21 @@
       </w:pPr>
       <w:r>
         <w:rPr>
-          <w:rFonts w:ascii="Times New Roman" w:hAnsi="Times New Roman"/>
-          <w:i/>
-          <w:color w:val="FF0000"/>
-          <w:sz w:val="24"/>
-        </w:rPr>
-        <w:t>Священник:</w:t>
-      </w:r>
-      <w:r>
-        <w:rPr>
-          <w:rFonts w:ascii="Times New Roman" w:hAnsi="Times New Roman"/>
-          <w:sz w:val="24"/>
+          <w:rFonts w:ascii="Times New Roman" w:cs="Times New Roman" w:eastAsia="Times New Roman" w:hAnsi="Times New Roman"/>
+          <w:i w:val="1"/>
+          <w:color w:val="ff0000"/>
+          <w:sz w:val="24"/>
+          <w:szCs w:val="24"/>
+          <w:rtl w:val="0"/>
+        </w:rPr>
+        <w:t xml:space="preserve">Священник:</w:t>
+      </w:r>
+      <w:r>
+        <w:rPr>
+          <w:rFonts w:ascii="Times New Roman" w:cs="Times New Roman" w:eastAsia="Times New Roman" w:hAnsi="Times New Roman"/>
+          <w:sz w:val="24"/>
+          <w:szCs w:val="24"/>
+          <w:rtl w:val="0"/>
         </w:rPr>
         <w:t xml:space="preserve"> Бо милостивий і людинолюбний Бог єси, і Тобі славу возсилаємо, Отцю, і Сину, і Святому Духові, нині, і повсякчас, і на віки віків.</w:t>
       </w:r>
@@ -26080,17 +25779,21 @@
       </w:pPr>
       <w:r>
         <w:rPr>
-          <w:rFonts w:ascii="Times New Roman" w:hAnsi="Times New Roman"/>
-          <w:i/>
-          <w:color w:val="FF0000"/>
-          <w:sz w:val="24"/>
-        </w:rPr>
-        <w:t>Священник:</w:t>
-      </w:r>
-      <w:r>
-        <w:rPr>
-          <w:rFonts w:ascii="Times New Roman" w:hAnsi="Times New Roman"/>
-          <w:sz w:val="24"/>
+          <w:rFonts w:ascii="Times New Roman" w:cs="Times New Roman" w:eastAsia="Times New Roman" w:hAnsi="Times New Roman"/>
+          <w:i w:val="1"/>
+          <w:color w:val="ff0000"/>
+          <w:sz w:val="24"/>
+          <w:szCs w:val="24"/>
+          <w:rtl w:val="0"/>
+        </w:rPr>
+        <w:t xml:space="preserve">Священник:</w:t>
+      </w:r>
+      <w:r>
+        <w:rPr>
+          <w:rFonts w:ascii="Times New Roman" w:cs="Times New Roman" w:eastAsia="Times New Roman" w:hAnsi="Times New Roman"/>
+          <w:sz w:val="24"/>
+          <w:szCs w:val="24"/>
+          <w:rtl w:val="0"/>
         </w:rPr>
         <w:t xml:space="preserve"> Бо Ти – Бог милости, ласк і людинолюбности, і Тобі славу возсилаємо, Отцю, і Сину, і Святому Духові, нині, і повсякчас, і на віки віків.</w:t>
       </w:r>
@@ -26148,17 +25851,21 @@
       </w:pPr>
       <w:r>
         <w:rPr>
-          <w:rFonts w:ascii="Times New Roman" w:hAnsi="Times New Roman"/>
-          <w:i/>
-          <w:color w:val="FF0000"/>
-          <w:sz w:val="24"/>
-        </w:rPr>
-        <w:t>Священник:</w:t>
-      </w:r>
-      <w:r>
-        <w:rPr>
-          <w:rFonts w:ascii="Times New Roman" w:hAnsi="Times New Roman"/>
-          <w:sz w:val="24"/>
+          <w:rFonts w:ascii="Times New Roman" w:cs="Times New Roman" w:eastAsia="Times New Roman" w:hAnsi="Times New Roman"/>
+          <w:i w:val="1"/>
+          <w:color w:val="ff0000"/>
+          <w:sz w:val="24"/>
+          <w:szCs w:val="24"/>
+          <w:rtl w:val="0"/>
+        </w:rPr>
+        <w:t xml:space="preserve">Священник:</w:t>
+      </w:r>
+      <w:r>
+        <w:rPr>
+          <w:rFonts w:ascii="Times New Roman" w:cs="Times New Roman" w:eastAsia="Times New Roman" w:hAnsi="Times New Roman"/>
+          <w:sz w:val="24"/>
+          <w:szCs w:val="24"/>
+          <w:rtl w:val="0"/>
         </w:rPr>
         <w:t xml:space="preserve"> Мир всім.</w:t>
       </w:r>
@@ -26307,17 +26014,21 @@
       </w:pPr>
       <w:r>
         <w:rPr>
-          <w:rFonts w:ascii="Times New Roman" w:hAnsi="Times New Roman"/>
-          <w:i/>
-          <w:color w:val="FF0000"/>
-          <w:sz w:val="24"/>
-        </w:rPr>
-        <w:t>Священник:</w:t>
-      </w:r>
-      <w:r>
-        <w:rPr>
-          <w:rFonts w:ascii="Times New Roman" w:hAnsi="Times New Roman"/>
-          <w:sz w:val="24"/>
+          <w:rFonts w:ascii="Times New Roman" w:cs="Times New Roman" w:eastAsia="Times New Roman" w:hAnsi="Times New Roman"/>
+          <w:i w:val="1"/>
+          <w:color w:val="ff0000"/>
+          <w:sz w:val="24"/>
+          <w:szCs w:val="24"/>
+          <w:rtl w:val="0"/>
+        </w:rPr>
+        <w:t xml:space="preserve">Священник:</w:t>
+      </w:r>
+      <w:r>
+        <w:rPr>
+          <w:rFonts w:ascii="Times New Roman" w:cs="Times New Roman" w:eastAsia="Times New Roman" w:hAnsi="Times New Roman"/>
+          <w:sz w:val="24"/>
+          <w:szCs w:val="24"/>
+          <w:rtl w:val="0"/>
         </w:rPr>
         <w:t xml:space="preserve"> Бо до Тебе належить милувати і спасати нас, Боже наш, і Тобі славу возсилаємо, Отцю, і Сину, і Святому Духові, нині, і повсякчас, і на віки віків.</w:t>
       </w:r>
@@ -26477,17 +26188,21 @@
       </w:pPr>
       <w:r>
         <w:rPr>
-          <w:rFonts w:ascii="Times New Roman" w:hAnsi="Times New Roman"/>
-          <w:i/>
-          <w:color w:val="FF0000"/>
-          <w:sz w:val="24"/>
-        </w:rPr>
-        <w:t>Священник:</w:t>
-      </w:r>
-      <w:r>
-        <w:rPr>
-          <w:rFonts w:ascii="Times New Roman" w:hAnsi="Times New Roman"/>
-          <w:sz w:val="24"/>
+          <w:rFonts w:ascii="Times New Roman" w:cs="Times New Roman" w:eastAsia="Times New Roman" w:hAnsi="Times New Roman"/>
+          <w:i w:val="1"/>
+          <w:color w:val="ff0000"/>
+          <w:sz w:val="24"/>
+          <w:szCs w:val="24"/>
+          <w:rtl w:val="0"/>
+        </w:rPr>
+        <w:t xml:space="preserve">Священник:</w:t>
+      </w:r>
+      <w:r>
+        <w:rPr>
+          <w:rFonts w:ascii="Times New Roman" w:cs="Times New Roman" w:eastAsia="Times New Roman" w:hAnsi="Times New Roman"/>
+          <w:sz w:val="24"/>
+          <w:szCs w:val="24"/>
+          <w:rtl w:val="0"/>
         </w:rPr>
         <w:t xml:space="preserve"> Благослове́нний Христо́с Бог наш, за́вжди, ни́ні, і повсякча́с, і на ві́ки вікі́в.</w:t>
       </w:r>
@@ -26543,17 +26258,21 @@
       </w:pPr>
       <w:r>
         <w:rPr>
-          <w:rFonts w:ascii="Times New Roman" w:hAnsi="Times New Roman"/>
-          <w:i/>
-          <w:color w:val="FF0000"/>
-          <w:sz w:val="24"/>
-        </w:rPr>
-        <w:t>Священник:</w:t>
-      </w:r>
-      <w:r>
-        <w:rPr>
-          <w:rFonts w:ascii="Times New Roman" w:hAnsi="Times New Roman"/>
-          <w:sz w:val="24"/>
+          <w:rFonts w:ascii="Times New Roman" w:cs="Times New Roman" w:eastAsia="Times New Roman" w:hAnsi="Times New Roman"/>
+          <w:i w:val="1"/>
+          <w:color w:val="ff0000"/>
+          <w:sz w:val="24"/>
+          <w:szCs w:val="24"/>
+          <w:rtl w:val="0"/>
+        </w:rPr>
+        <w:t xml:space="preserve">Священник:</w:t>
+      </w:r>
+      <w:r>
+        <w:rPr>
+          <w:rFonts w:ascii="Times New Roman" w:cs="Times New Roman" w:eastAsia="Times New Roman" w:hAnsi="Times New Roman"/>
+          <w:sz w:val="24"/>
+          <w:szCs w:val="24"/>
+          <w:rtl w:val="0"/>
         </w:rPr>
         <w:t xml:space="preserve"> Пресвята́ Богоро́дице, спаси́ нас.</w:t>
       </w:r>
@@ -26609,17 +26328,21 @@
       </w:pPr>
       <w:r>
         <w:rPr>
-          <w:rFonts w:ascii="Times New Roman" w:hAnsi="Times New Roman"/>
-          <w:i/>
-          <w:color w:val="FF0000"/>
-          <w:sz w:val="24"/>
-        </w:rPr>
-        <w:t>Священник:</w:t>
-      </w:r>
-      <w:r>
-        <w:rPr>
-          <w:rFonts w:ascii="Times New Roman" w:hAnsi="Times New Roman"/>
-          <w:sz w:val="24"/>
+          <w:rFonts w:ascii="Times New Roman" w:cs="Times New Roman" w:eastAsia="Times New Roman" w:hAnsi="Times New Roman"/>
+          <w:i w:val="1"/>
+          <w:color w:val="ff0000"/>
+          <w:sz w:val="24"/>
+          <w:szCs w:val="24"/>
+          <w:rtl w:val="0"/>
+        </w:rPr>
+        <w:t xml:space="preserve">Священник:</w:t>
+      </w:r>
+      <w:r>
+        <w:rPr>
+          <w:rFonts w:ascii="Times New Roman" w:cs="Times New Roman" w:eastAsia="Times New Roman" w:hAnsi="Times New Roman"/>
+          <w:sz w:val="24"/>
+          <w:szCs w:val="24"/>
+          <w:rtl w:val="0"/>
         </w:rPr>
         <w:t xml:space="preserve"> Сла́ва Тобі́, Хри́сте Бо́же, упова́ння на́ше, сла́ва Тобі́!</w:t>
       </w:r>
@@ -26686,39 +26409,53 @@
     </w:p>
     <w:p>
       <w:pPr>
-        <w:spacing w:after="120"/>
-      </w:pPr>
-      <w:r>
-        <w:rPr>
-          <w:rFonts w:ascii="Times New Roman" w:hAnsi="Times New Roman"/>
-          <w:i/>
-          <w:color w:val="FF0000"/>
-          <w:sz w:val="24"/>
-        </w:rPr>
-        <w:t>Священник:</w:t>
-      </w:r>
-      <w:r>
-        <w:rPr>
-          <w:rFonts w:ascii="Times New Roman" w:hAnsi="Times New Roman"/>
-          <w:sz w:val="24"/>
+        <w:spacing w:after="120" w:lineRule="auto"/>
+        <w:rPr/>
+      </w:pPr>
+      <w:r>
+        <w:rPr>
+          <w:rFonts w:ascii="Times New Roman" w:cs="Times New Roman" w:eastAsia="Times New Roman" w:hAnsi="Times New Roman"/>
+          <w:i w:val="1"/>
+          <w:color w:val="ff0000"/>
+          <w:sz w:val="24"/>
+          <w:szCs w:val="24"/>
+          <w:rtl w:val="0"/>
+        </w:rPr>
+        <w:t xml:space="preserve">Священник:</w:t>
+      </w:r>
+      <w:r>
+        <w:rPr>
+          <w:rFonts w:ascii="Times New Roman" w:cs="Times New Roman" w:eastAsia="Times New Roman" w:hAnsi="Times New Roman"/>
+          <w:sz w:val="24"/>
+          <w:szCs w:val="24"/>
+          <w:rtl w:val="0"/>
         </w:rPr>
         <w:t xml:space="preserve"> Христос, що воскрес із мертвих, істинний Бог наш - молитвами пречистої Своєї Матері, святих славних і всехвальних апостолів, і святого, </w:t>
       </w:r>
       <w:r>
         <w:rPr>
-          <w:rFonts w:ascii="Times New Roman" w:hAnsi="Times New Roman"/>
-          <w:i/>
-          <w:color w:val="FF0000"/>
-          <w:sz w:val="24"/>
-        </w:rPr>
-        <w:t>якого є храм</w:t>
-      </w:r>
-      <w:r>
-        <w:rPr>
-          <w:rFonts w:ascii="Times New Roman" w:hAnsi="Times New Roman"/>
-          <w:sz w:val="24"/>
-        </w:rPr>
-        <w:t>, і святої великомучениці Анастасії, і всіх святих - помилує і спасе нас як благий і людинолюбний.</w:t>
+          <w:rFonts w:ascii="Times New Roman" w:cs="Times New Roman" w:eastAsia="Times New Roman" w:hAnsi="Times New Roman"/>
+          <w:i w:val="1"/>
+          <w:color w:val="ff0000"/>
+          <w:sz w:val="24"/>
+          <w:szCs w:val="24"/>
+          <w:rtl w:val="0"/>
+        </w:rPr>
+        <w:t xml:space="preserve">якого є храм</w:t>
+      </w:r>
+      <w:r>
+        <w:rPr>
+          <w:rFonts w:ascii="Times New Roman" w:cs="Times New Roman" w:eastAsia="Times New Roman" w:hAnsi="Times New Roman"/>
+          <w:sz w:val="24"/>
+          <w:szCs w:val="24"/>
+          <w:rtl w:val="0"/>
+        </w:rPr>
+        <w:t xml:space="preserve">, і святої великомучениці Анастасії, і всіх святих - помилує і спасе нас як благий і людинолюбний.</w:t>
+      </w:r>
+      <w:r>
+        <w:rPr>
+          <w:rtl w:val="0"/>
+        </w:rPr>
       </w:r>
     </w:p>
     <w:p>
@@ -26912,6 +26649,123 @@
       </w:pPr>
     </w:pPrDefault>
   </w:docDefaults>
+  <w:style w:type="paragraph" w:styleId="Normal" w:default="1">
+    <w:name w:val="normal"/>
+  </w:style>
+  <w:style w:type="table" w:styleId="TableNormal" w:default="1">
+    <w:name w:val="Table Normal"/>
+  </w:style>
+  <w:style w:type="paragraph" w:styleId="Heading1">
+    <w:name w:val="heading 1"/>
+    <w:basedOn w:val="Normal"/>
+    <w:next w:val="Normal"/>
+    <w:pPr>
+      <w:keepNext w:val="1"/>
+      <w:keepLines w:val="1"/>
+      <w:spacing w:after="0" w:before="480" w:lineRule="auto"/>
+    </w:pPr>
+    <w:rPr>
+      <w:rFonts w:ascii="Calibri" w:cs="Calibri" w:eastAsia="Calibri" w:hAnsi="Calibri"/>
+      <w:b w:val="1"/>
+      <w:color w:val="366091"/>
+      <w:sz w:val="28"/>
+      <w:szCs w:val="28"/>
+    </w:rPr>
+  </w:style>
+  <w:style w:type="paragraph" w:styleId="Heading2">
+    <w:name w:val="heading 2"/>
+    <w:basedOn w:val="Normal"/>
+    <w:next w:val="Normal"/>
+    <w:pPr>
+      <w:keepNext w:val="1"/>
+      <w:keepLines w:val="1"/>
+      <w:spacing w:after="0" w:before="200" w:lineRule="auto"/>
+    </w:pPr>
+    <w:rPr>
+      <w:rFonts w:ascii="Calibri" w:cs="Calibri" w:eastAsia="Calibri" w:hAnsi="Calibri"/>
+      <w:b w:val="1"/>
+      <w:color w:val="4f81bd"/>
+      <w:sz w:val="26"/>
+      <w:szCs w:val="26"/>
+    </w:rPr>
+  </w:style>
+  <w:style w:type="paragraph" w:styleId="Heading3">
+    <w:name w:val="heading 3"/>
+    <w:basedOn w:val="Normal"/>
+    <w:next w:val="Normal"/>
+    <w:pPr>
+      <w:keepNext w:val="1"/>
+      <w:keepLines w:val="1"/>
+      <w:spacing w:after="0" w:before="200" w:lineRule="auto"/>
+    </w:pPr>
+    <w:rPr>
+      <w:rFonts w:ascii="Calibri" w:cs="Calibri" w:eastAsia="Calibri" w:hAnsi="Calibri"/>
+      <w:b w:val="1"/>
+      <w:color w:val="4f81bd"/>
+    </w:rPr>
+  </w:style>
+  <w:style w:type="paragraph" w:styleId="Heading4">
+    <w:name w:val="heading 4"/>
+    <w:basedOn w:val="Normal"/>
+    <w:next w:val="Normal"/>
+    <w:pPr>
+      <w:keepNext w:val="1"/>
+      <w:keepLines w:val="1"/>
+      <w:spacing w:after="0" w:before="200" w:lineRule="auto"/>
+    </w:pPr>
+    <w:rPr>
+      <w:rFonts w:ascii="Calibri" w:cs="Calibri" w:eastAsia="Calibri" w:hAnsi="Calibri"/>
+      <w:b w:val="1"/>
+      <w:i w:val="1"/>
+      <w:color w:val="4f81bd"/>
+    </w:rPr>
+  </w:style>
+  <w:style w:type="paragraph" w:styleId="Heading5">
+    <w:name w:val="heading 5"/>
+    <w:basedOn w:val="Normal"/>
+    <w:next w:val="Normal"/>
+    <w:pPr>
+      <w:keepNext w:val="1"/>
+      <w:keepLines w:val="1"/>
+      <w:spacing w:after="0" w:before="200" w:lineRule="auto"/>
+    </w:pPr>
+    <w:rPr>
+      <w:rFonts w:ascii="Calibri" w:cs="Calibri" w:eastAsia="Calibri" w:hAnsi="Calibri"/>
+      <w:color w:val="243f61"/>
+    </w:rPr>
+  </w:style>
+  <w:style w:type="paragraph" w:styleId="Heading6">
+    <w:name w:val="heading 6"/>
+    <w:basedOn w:val="Normal"/>
+    <w:next w:val="Normal"/>
+    <w:pPr>
+      <w:keepNext w:val="1"/>
+      <w:keepLines w:val="1"/>
+      <w:spacing w:after="0" w:before="200" w:lineRule="auto"/>
+    </w:pPr>
+    <w:rPr>
+      <w:rFonts w:ascii="Calibri" w:cs="Calibri" w:eastAsia="Calibri" w:hAnsi="Calibri"/>
+      <w:i w:val="1"/>
+      <w:color w:val="243f61"/>
+    </w:rPr>
+  </w:style>
+  <w:style w:type="paragraph" w:styleId="Title">
+    <w:name w:val="Title"/>
+    <w:basedOn w:val="Normal"/>
+    <w:next w:val="Normal"/>
+    <w:pPr>
+      <w:pBdr>
+        <w:bottom w:color="4f81bd" w:space="4" w:sz="8" w:val="single"/>
+      </w:pBdr>
+      <w:spacing w:after="300" w:line="240" w:lineRule="auto"/>
+    </w:pPr>
+    <w:rPr>
+      <w:rFonts w:ascii="Calibri" w:cs="Calibri" w:eastAsia="Calibri" w:hAnsi="Calibri"/>
+      <w:color w:val="17365d"/>
+      <w:sz w:val="52"/>
+      <w:szCs w:val="52"/>
+    </w:rPr>
+  </w:style>
   <w:style w:type="paragraph" w:styleId="Normal" w:default="1">
     <w:name w:val="normal"/>
   </w:style>
@@ -38036,6 +37890,19 @@
       <w:szCs w:val="24"/>
     </w:rPr>
   </w:style>
+  <w:style w:type="paragraph" w:styleId="Subtitle">
+    <w:name w:val="Subtitle"/>
+    <w:basedOn w:val="Normal"/>
+    <w:next w:val="Normal"/>
+    <w:pPr/>
+    <w:rPr>
+      <w:rFonts w:ascii="Calibri" w:cs="Calibri" w:eastAsia="Calibri" w:hAnsi="Calibri"/>
+      <w:i w:val="1"/>
+      <w:color w:val="4f81bd"/>
+      <w:sz w:val="24"/>
+      <w:szCs w:val="24"/>
+    </w:rPr>
+  </w:style>
 </w:styles>
 </file>
 

</xml_diff>